<commit_message>
Baholash mezonlari (rubrika) jadvallarini qo'shish
"O'qitish natijalarini baholash tartibi" bo'limi qo'shildi: 2/3/4/5
(qoniqarsiz/qoniqarli/yaxshi/a'lo) darajali baholash mezonlari,
birlashtirilgan kataklar (vMerge) va rangli baho ustuni bilan. Hujjat
jami ~85 varoq, 56 jadval.

Co-Authored-By: Claude Opus 4.8 <noreply@anthropic.com>
Claude-Session: https://claude.ai/code/session_01Bu44dXWT8LQg9cvvD4SRXw
</commit_message>
<xml_diff>
--- a/Mehnat_muhofazasi_va_texnika_xavfsizligi.docx
+++ b/Mehnat_muhofazasi_va_texnika_xavfsizligi.docx
@@ -26637,6 +26637,3231 @@
       </w:pPr>
       <w:r>
         <w:t xml:space="preserve">Payvandlash ishlari bir necha xavfli omilni birlashtiradi va maxsus himoyani talab qiladi.</w:t>
+      </w:r>
+    </w:p>
+    <w:p>
+      <w:r>
+        <w:br w:type="page"/>
+      </w:r>
+    </w:p>
+    <w:p>
+      <w:pPr>
+        <w:pStyle w:val="Heading1"/>
+        <w:spacing w:after="200" w:before="320"/>
+        <w:jc w:val="left"/>
+      </w:pPr>
+      <w:r>
+        <w:rPr>
+          <w:b/>
+          <w:bCs/>
+          <w:color w:val="1F3864"/>
+          <w:sz w:val="30"/>
+          <w:szCs w:val="30"/>
+        </w:rPr>
+        <w:t xml:space="preserve">O'QITISH NATIJALARINI BAHOLASH TARTIBI</w:t>
+      </w:r>
+    </w:p>
+    <w:p>
+      <w:pPr>
+        <w:spacing w:after="120" w:before="0" w:line="360"/>
+        <w:ind w:firstLine="709"/>
+        <w:jc w:val="both"/>
+      </w:pPr>
+      <w:r>
+        <w:t xml:space="preserve">Mehnat muhofazasi va texnika xavfsizligi fani bo'yicha o'quvchilarning bilim, ko'nikma va malakalari quyidagi mezonlar asosida baholanadi. Har bir o'qitish natijasi bo'yicha to'rt darajali baho qo'yiladi: 2 (qoniqarsiz), 3 (qoniqarli), 4 (yaxshi) va 5 (a'lo). Baholash indikatorlari o'quvchining tegishli qoidalarni tushuntirishi va ularni amaliyotda qo'llash darajasini aks ettiradi.</w:t>
+      </w:r>
+    </w:p>
+    <w:p>
+      <w:pPr>
+        <w:pStyle w:val="Heading2"/>
+        <w:spacing w:after="140" w:before="240"/>
+      </w:pPr>
+      <w:r>
+        <w:rPr>
+          <w:b/>
+          <w:bCs/>
+          <w:color w:val="2E5496"/>
+          <w:sz w:val="27"/>
+          <w:szCs w:val="27"/>
+        </w:rPr>
+        <w:t xml:space="preserve">1-o'qitish natijasi bo'yicha baholash mezonlari</w:t>
+      </w:r>
+    </w:p>
+    <w:p>
+      <w:pPr>
+        <w:spacing w:after="60" w:before="140"/>
+        <w:jc w:val="left"/>
+      </w:pPr>
+      <w:r>
+        <w:rPr>
+          <w:b/>
+          <w:bCs/>
+          <w:i/>
+          <w:iCs/>
+          <w:color w:val="44546A"/>
+          <w:sz w:val="22"/>
+          <w:szCs w:val="22"/>
+        </w:rPr>
+        <w:t xml:space="preserve">B.1-jadval. Xavfsiz mehnat sharoitlari bo'yicha baholash</w:t>
+      </w:r>
+    </w:p>
+    <w:tbl>
+      <w:tblPr>
+        <w:tblW w:type="dxa" w:w="9638"/>
+        <w:tblBorders>
+          <w:top w:val="single" w:color="auto" w:sz="4"/>
+          <w:left w:val="single" w:color="auto" w:sz="4"/>
+          <w:bottom w:val="single" w:color="auto" w:sz="4"/>
+          <w:right w:val="single" w:color="auto" w:sz="4"/>
+          <w:insideH w:val="single" w:color="auto" w:sz="4"/>
+          <w:insideV w:val="single" w:color="auto" w:sz="4"/>
+        </w:tblBorders>
+      </w:tblPr>
+      <w:tblGrid>
+        <w:gridCol w:w="1750"/>
+        <w:gridCol w:w="1750"/>
+        <w:gridCol w:w="4638"/>
+        <w:gridCol w:w="1500"/>
+      </w:tblGrid>
+      <w:tr>
+        <w:trPr>
+          <w:tblHeader/>
+        </w:trPr>
+        <w:tc>
+          <w:tcPr>
+            <w:tcW w:type="dxa" w:w="1750"/>
+            <w:shd w:fill="1F3864" w:color="auto" w:val="clear"/>
+            <w:tcMar>
+              <w:top w:type="dxa" w:w="40"/>
+              <w:left w:type="dxa" w:w="90"/>
+              <w:bottom w:type="dxa" w:w="40"/>
+              <w:right w:type="dxa" w:w="90"/>
+            </w:tcMar>
+            <w:vAlign w:val="center"/>
+          </w:tcPr>
+          <w:p>
+            <w:pPr>
+              <w:spacing w:after="0" w:line="264"/>
+              <w:jc w:val="center"/>
+            </w:pPr>
+            <w:r>
+              <w:rPr>
+                <w:b/>
+                <w:bCs/>
+                <w:color w:val="FFFFFF"/>
+                <w:sz w:val="22"/>
+                <w:szCs w:val="22"/>
+              </w:rPr>
+              <w:t xml:space="preserve">O'qitish natijasi</w:t>
+            </w:r>
+          </w:p>
+        </w:tc>
+        <w:tc>
+          <w:tcPr>
+            <w:tcW w:type="dxa" w:w="1750"/>
+            <w:shd w:fill="1F3864" w:color="auto" w:val="clear"/>
+            <w:tcMar>
+              <w:top w:type="dxa" w:w="40"/>
+              <w:left w:type="dxa" w:w="90"/>
+              <w:bottom w:type="dxa" w:w="40"/>
+              <w:right w:type="dxa" w:w="90"/>
+            </w:tcMar>
+            <w:vAlign w:val="center"/>
+          </w:tcPr>
+          <w:p>
+            <w:pPr>
+              <w:spacing w:after="0" w:line="264"/>
+              <w:jc w:val="center"/>
+            </w:pPr>
+            <w:r>
+              <w:rPr>
+                <w:b/>
+                <w:bCs/>
+                <w:color w:val="FFFFFF"/>
+                <w:sz w:val="22"/>
+                <w:szCs w:val="22"/>
+              </w:rPr>
+              <w:t xml:space="preserve">Baholash indikatori</w:t>
+            </w:r>
+          </w:p>
+        </w:tc>
+        <w:tc>
+          <w:tcPr>
+            <w:tcW w:type="dxa" w:w="4638"/>
+            <w:shd w:fill="1F3864" w:color="auto" w:val="clear"/>
+            <w:tcMar>
+              <w:top w:type="dxa" w:w="40"/>
+              <w:left w:type="dxa" w:w="90"/>
+              <w:bottom w:type="dxa" w:w="40"/>
+              <w:right w:type="dxa" w:w="90"/>
+            </w:tcMar>
+            <w:vAlign w:val="center"/>
+          </w:tcPr>
+          <w:p>
+            <w:pPr>
+              <w:spacing w:after="0" w:line="264"/>
+              <w:jc w:val="center"/>
+            </w:pPr>
+            <w:r>
+              <w:rPr>
+                <w:b/>
+                <w:bCs/>
+                <w:color w:val="FFFFFF"/>
+                <w:sz w:val="22"/>
+                <w:szCs w:val="22"/>
+              </w:rPr>
+              <w:t xml:space="preserve">Baholashga qo'yilgan kriteriyalar</w:t>
+            </w:r>
+          </w:p>
+        </w:tc>
+        <w:tc>
+          <w:tcPr>
+            <w:tcW w:type="dxa" w:w="1500"/>
+            <w:shd w:fill="1F3864" w:color="auto" w:val="clear"/>
+            <w:tcMar>
+              <w:top w:type="dxa" w:w="40"/>
+              <w:left w:type="dxa" w:w="90"/>
+              <w:bottom w:type="dxa" w:w="40"/>
+              <w:right w:type="dxa" w:w="90"/>
+            </w:tcMar>
+            <w:vAlign w:val="center"/>
+          </w:tcPr>
+          <w:p>
+            <w:pPr>
+              <w:spacing w:after="0" w:line="264"/>
+              <w:jc w:val="center"/>
+            </w:pPr>
+            <w:r>
+              <w:rPr>
+                <w:b/>
+                <w:bCs/>
+                <w:color w:val="FFFFFF"/>
+                <w:sz w:val="22"/>
+                <w:szCs w:val="22"/>
+              </w:rPr>
+              <w:t xml:space="preserve">Baholanishi</w:t>
+            </w:r>
+          </w:p>
+        </w:tc>
+      </w:tr>
+      <w:tr>
+        <w:tc>
+          <w:tcPr>
+            <w:tcW w:type="dxa" w:w="1750"/>
+            <w:vMerge w:val="restart"/>
+            <w:tcMar>
+              <w:top w:type="dxa" w:w="50"/>
+              <w:left w:type="dxa" w:w="90"/>
+              <w:bottom w:type="dxa" w:w="50"/>
+              <w:right w:type="dxa" w:w="90"/>
+            </w:tcMar>
+            <w:vAlign w:val="center"/>
+          </w:tcPr>
+          <w:p>
+            <w:pPr>
+              <w:spacing w:after="0" w:line="252"/>
+              <w:jc w:val="left"/>
+            </w:pPr>
+            <w:r>
+              <w:rPr>
+                <w:b/>
+                <w:bCs/>
+                <w:sz w:val="20"/>
+                <w:szCs w:val="20"/>
+              </w:rPr>
+              <w:t xml:space="preserve">Ish joyida sanitariya-gigiyena, elektr va yong'in xavfsizligi qoidalariga rioya qiladi hamda xavfsiz mehnat usullarini qo'llaydi.</w:t>
+            </w:r>
+          </w:p>
+        </w:tc>
+        <w:tc>
+          <w:tcPr>
+            <w:tcW w:type="dxa" w:w="1750"/>
+            <w:vMerge w:val="restart"/>
+            <w:tcMar>
+              <w:top w:type="dxa" w:w="50"/>
+              <w:left w:type="dxa" w:w="90"/>
+              <w:bottom w:type="dxa" w:w="50"/>
+              <w:right w:type="dxa" w:w="90"/>
+            </w:tcMar>
+            <w:vAlign w:val="center"/>
+          </w:tcPr>
+          <w:p>
+            <w:pPr>
+              <w:spacing w:after="0" w:line="252"/>
+              <w:jc w:val="left"/>
+            </w:pPr>
+            <w:r>
+              <w:rPr>
+                <w:b w:val="false"/>
+                <w:bCs w:val="false"/>
+                <w:sz w:val="20"/>
+                <w:szCs w:val="20"/>
+              </w:rPr>
+              <w:t xml:space="preserve">Sanitariya-gigiyena, elektr va yong'in xavfsizligi qoidalarini tushuntirish.</w:t>
+            </w:r>
+          </w:p>
+        </w:tc>
+        <w:tc>
+          <w:tcPr>
+            <w:tcW w:type="dxa" w:w="4638"/>
+            <w:tcMar>
+              <w:top w:type="dxa" w:w="50"/>
+              <w:left w:type="dxa" w:w="90"/>
+              <w:bottom w:type="dxa" w:w="50"/>
+              <w:right w:type="dxa" w:w="90"/>
+            </w:tcMar>
+            <w:vAlign w:val="top"/>
+          </w:tcPr>
+          <w:p>
+            <w:pPr>
+              <w:spacing w:after="0" w:line="252"/>
+              <w:jc w:val="left"/>
+            </w:pPr>
+            <w:r>
+              <w:rPr>
+                <w:b w:val="false"/>
+                <w:bCs w:val="false"/>
+                <w:sz w:val="20"/>
+                <w:szCs w:val="20"/>
+              </w:rPr>
+              <w:t xml:space="preserve">Sanitariya-gigiyena, elektr va yong'in xavfsizligi qoidalarini bilmaydi yoki noto'g'ri tushuntiradi.</w:t>
+            </w:r>
+          </w:p>
+        </w:tc>
+        <w:tc>
+          <w:tcPr>
+            <w:tcW w:type="dxa" w:w="1500"/>
+            <w:shd w:fill="FBE2E2" w:color="auto" w:val="clear"/>
+            <w:tcMar>
+              <w:top w:type="dxa" w:w="50"/>
+              <w:left w:type="dxa" w:w="90"/>
+              <w:bottom w:type="dxa" w:w="50"/>
+              <w:right w:type="dxa" w:w="90"/>
+            </w:tcMar>
+            <w:vAlign w:val="center"/>
+          </w:tcPr>
+          <w:p>
+            <w:pPr>
+              <w:spacing w:after="0" w:line="252"/>
+              <w:jc w:val="center"/>
+            </w:pPr>
+            <w:r>
+              <w:rPr>
+                <w:b/>
+                <w:bCs/>
+                <w:sz w:val="20"/>
+                <w:szCs w:val="20"/>
+              </w:rPr>
+              <w:t xml:space="preserve">2 (qoniqarsiz)</w:t>
+            </w:r>
+          </w:p>
+        </w:tc>
+      </w:tr>
+      <w:tr>
+        <w:tc>
+          <w:tcPr>
+            <w:vMerge w:val="continue"/>
+          </w:tcPr>
+          <w:p/>
+        </w:tc>
+        <w:tc>
+          <w:tcPr>
+            <w:vMerge w:val="continue"/>
+          </w:tcPr>
+          <w:p/>
+        </w:tc>
+        <w:tc>
+          <w:tcPr>
+            <w:tcW w:type="dxa" w:w="4638"/>
+            <w:tcMar>
+              <w:top w:type="dxa" w:w="50"/>
+              <w:left w:type="dxa" w:w="90"/>
+              <w:bottom w:type="dxa" w:w="50"/>
+              <w:right w:type="dxa" w:w="90"/>
+            </w:tcMar>
+            <w:vAlign w:val="top"/>
+          </w:tcPr>
+          <w:p>
+            <w:pPr>
+              <w:spacing w:after="0" w:line="252"/>
+              <w:jc w:val="left"/>
+            </w:pPr>
+            <w:r>
+              <w:rPr>
+                <w:b w:val="false"/>
+                <w:bCs w:val="false"/>
+                <w:sz w:val="20"/>
+                <w:szCs w:val="20"/>
+              </w:rPr>
+              <w:t xml:space="preserve">Sanitariya-gigiyena, elektr va yong'in xavfsizligi qoidalarini qisman tushuntiradi, ayrim talablarni farqlaydi, biroq ularning ish joyidagi ahamiyatini to'liq izohlay olmaydi.</w:t>
+            </w:r>
+          </w:p>
+        </w:tc>
+        <w:tc>
+          <w:tcPr>
+            <w:tcW w:type="dxa" w:w="1500"/>
+            <w:shd w:fill="FFF4D6" w:color="auto" w:val="clear"/>
+            <w:tcMar>
+              <w:top w:type="dxa" w:w="50"/>
+              <w:left w:type="dxa" w:w="90"/>
+              <w:bottom w:type="dxa" w:w="50"/>
+              <w:right w:type="dxa" w:w="90"/>
+            </w:tcMar>
+            <w:vAlign w:val="center"/>
+          </w:tcPr>
+          <w:p>
+            <w:pPr>
+              <w:spacing w:after="0" w:line="252"/>
+              <w:jc w:val="center"/>
+            </w:pPr>
+            <w:r>
+              <w:rPr>
+                <w:b/>
+                <w:bCs/>
+                <w:sz w:val="20"/>
+                <w:szCs w:val="20"/>
+              </w:rPr>
+              <w:t xml:space="preserve">3 (qoniqarli)</w:t>
+            </w:r>
+          </w:p>
+        </w:tc>
+      </w:tr>
+      <w:tr>
+        <w:tc>
+          <w:tcPr>
+            <w:vMerge w:val="continue"/>
+          </w:tcPr>
+          <w:p/>
+        </w:tc>
+        <w:tc>
+          <w:tcPr>
+            <w:vMerge w:val="continue"/>
+          </w:tcPr>
+          <w:p/>
+        </w:tc>
+        <w:tc>
+          <w:tcPr>
+            <w:tcW w:type="dxa" w:w="4638"/>
+            <w:tcMar>
+              <w:top w:type="dxa" w:w="50"/>
+              <w:left w:type="dxa" w:w="90"/>
+              <w:bottom w:type="dxa" w:w="50"/>
+              <w:right w:type="dxa" w:w="90"/>
+            </w:tcMar>
+            <w:vAlign w:val="top"/>
+          </w:tcPr>
+          <w:p>
+            <w:pPr>
+              <w:spacing w:after="0" w:line="252"/>
+              <w:jc w:val="left"/>
+            </w:pPr>
+            <w:r>
+              <w:rPr>
+                <w:b w:val="false"/>
+                <w:bCs w:val="false"/>
+                <w:sz w:val="20"/>
+                <w:szCs w:val="20"/>
+              </w:rPr>
+              <w:t xml:space="preserve">Sanitariya-gigiyena, elektr va yong'in xavfsizligi qoidalarini to'g'ri tushuntiradi, ularni ish jarayonida qo'llashni izohlaydi, ayrim kichik noaniqliklarga yo'l qo'yadi.</w:t>
+            </w:r>
+          </w:p>
+        </w:tc>
+        <w:tc>
+          <w:tcPr>
+            <w:tcW w:type="dxa" w:w="1500"/>
+            <w:shd w:fill="E5EDF8" w:color="auto" w:val="clear"/>
+            <w:tcMar>
+              <w:top w:type="dxa" w:w="50"/>
+              <w:left w:type="dxa" w:w="90"/>
+              <w:bottom w:type="dxa" w:w="50"/>
+              <w:right w:type="dxa" w:w="90"/>
+            </w:tcMar>
+            <w:vAlign w:val="center"/>
+          </w:tcPr>
+          <w:p>
+            <w:pPr>
+              <w:spacing w:after="0" w:line="252"/>
+              <w:jc w:val="center"/>
+            </w:pPr>
+            <w:r>
+              <w:rPr>
+                <w:b/>
+                <w:bCs/>
+                <w:sz w:val="20"/>
+                <w:szCs w:val="20"/>
+              </w:rPr>
+              <w:t xml:space="preserve">4 (yaxshi)</w:t>
+            </w:r>
+          </w:p>
+        </w:tc>
+      </w:tr>
+      <w:tr>
+        <w:tc>
+          <w:tcPr>
+            <w:vMerge w:val="continue"/>
+          </w:tcPr>
+          <w:p/>
+        </w:tc>
+        <w:tc>
+          <w:tcPr>
+            <w:vMerge w:val="continue"/>
+          </w:tcPr>
+          <w:p/>
+        </w:tc>
+        <w:tc>
+          <w:tcPr>
+            <w:tcW w:type="dxa" w:w="4638"/>
+            <w:tcMar>
+              <w:top w:type="dxa" w:w="50"/>
+              <w:left w:type="dxa" w:w="90"/>
+              <w:bottom w:type="dxa" w:w="50"/>
+              <w:right w:type="dxa" w:w="90"/>
+            </w:tcMar>
+            <w:vAlign w:val="top"/>
+          </w:tcPr>
+          <w:p>
+            <w:pPr>
+              <w:spacing w:after="0" w:line="252"/>
+              <w:jc w:val="left"/>
+            </w:pPr>
+            <w:r>
+              <w:rPr>
+                <w:b w:val="false"/>
+                <w:bCs w:val="false"/>
+                <w:sz w:val="20"/>
+                <w:szCs w:val="20"/>
+              </w:rPr>
+              <w:t xml:space="preserve">Sanitariya-gigiyena, elektr va yong'in xavfsizligi qoidalarini to'liq tushuntiradi, ularning ish joyidagi ahamiyatini asoslaydi va amaliy misollar bilan izohlaydi.</w:t>
+            </w:r>
+          </w:p>
+        </w:tc>
+        <w:tc>
+          <w:tcPr>
+            <w:tcW w:type="dxa" w:w="1500"/>
+            <w:shd w:fill="E3F1E3" w:color="auto" w:val="clear"/>
+            <w:tcMar>
+              <w:top w:type="dxa" w:w="50"/>
+              <w:left w:type="dxa" w:w="90"/>
+              <w:bottom w:type="dxa" w:w="50"/>
+              <w:right w:type="dxa" w:w="90"/>
+            </w:tcMar>
+            <w:vAlign w:val="center"/>
+          </w:tcPr>
+          <w:p>
+            <w:pPr>
+              <w:spacing w:after="0" w:line="252"/>
+              <w:jc w:val="center"/>
+            </w:pPr>
+            <w:r>
+              <w:rPr>
+                <w:b/>
+                <w:bCs/>
+                <w:sz w:val="20"/>
+                <w:szCs w:val="20"/>
+              </w:rPr>
+              <w:t xml:space="preserve">5 (a'lo)</w:t>
+            </w:r>
+          </w:p>
+        </w:tc>
+      </w:tr>
+      <w:tr>
+        <w:tc>
+          <w:tcPr>
+            <w:vMerge w:val="continue"/>
+          </w:tcPr>
+          <w:p/>
+        </w:tc>
+        <w:tc>
+          <w:tcPr>
+            <w:tcW w:type="dxa" w:w="1750"/>
+            <w:vMerge w:val="restart"/>
+            <w:tcMar>
+              <w:top w:type="dxa" w:w="50"/>
+              <w:left w:type="dxa" w:w="90"/>
+              <w:bottom w:type="dxa" w:w="50"/>
+              <w:right w:type="dxa" w:w="90"/>
+            </w:tcMar>
+            <w:vAlign w:val="center"/>
+          </w:tcPr>
+          <w:p>
+            <w:pPr>
+              <w:spacing w:after="0" w:line="252"/>
+              <w:jc w:val="left"/>
+            </w:pPr>
+            <w:r>
+              <w:rPr>
+                <w:b w:val="false"/>
+                <w:bCs w:val="false"/>
+                <w:sz w:val="20"/>
+                <w:szCs w:val="20"/>
+              </w:rPr>
+              <w:t xml:space="preserve">Xavfsiz mehnat usullarini amaliy faoliyatda qo'llash.</w:t>
+            </w:r>
+          </w:p>
+        </w:tc>
+        <w:tc>
+          <w:tcPr>
+            <w:tcW w:type="dxa" w:w="4638"/>
+            <w:tcMar>
+              <w:top w:type="dxa" w:w="50"/>
+              <w:left w:type="dxa" w:w="90"/>
+              <w:bottom w:type="dxa" w:w="50"/>
+              <w:right w:type="dxa" w:w="90"/>
+            </w:tcMar>
+            <w:vAlign w:val="top"/>
+          </w:tcPr>
+          <w:p>
+            <w:pPr>
+              <w:spacing w:after="0" w:line="252"/>
+              <w:jc w:val="left"/>
+            </w:pPr>
+            <w:r>
+              <w:rPr>
+                <w:b w:val="false"/>
+                <w:bCs w:val="false"/>
+                <w:sz w:val="20"/>
+                <w:szCs w:val="20"/>
+              </w:rPr>
+              <w:t xml:space="preserve">Xavfsiz mehnat usullariga amal qilmaydi, ish jarayonida xavfsizlik talablarini buzadi.</w:t>
+            </w:r>
+          </w:p>
+        </w:tc>
+        <w:tc>
+          <w:tcPr>
+            <w:tcW w:type="dxa" w:w="1500"/>
+            <w:shd w:fill="FBE2E2" w:color="auto" w:val="clear"/>
+            <w:tcMar>
+              <w:top w:type="dxa" w:w="50"/>
+              <w:left w:type="dxa" w:w="90"/>
+              <w:bottom w:type="dxa" w:w="50"/>
+              <w:right w:type="dxa" w:w="90"/>
+            </w:tcMar>
+            <w:vAlign w:val="center"/>
+          </w:tcPr>
+          <w:p>
+            <w:pPr>
+              <w:spacing w:after="0" w:line="252"/>
+              <w:jc w:val="center"/>
+            </w:pPr>
+            <w:r>
+              <w:rPr>
+                <w:b/>
+                <w:bCs/>
+                <w:sz w:val="20"/>
+                <w:szCs w:val="20"/>
+              </w:rPr>
+              <w:t xml:space="preserve">2 (qoniqarsiz)</w:t>
+            </w:r>
+          </w:p>
+        </w:tc>
+      </w:tr>
+      <w:tr>
+        <w:tc>
+          <w:tcPr>
+            <w:vMerge w:val="continue"/>
+          </w:tcPr>
+          <w:p/>
+        </w:tc>
+        <w:tc>
+          <w:tcPr>
+            <w:vMerge w:val="continue"/>
+          </w:tcPr>
+          <w:p/>
+        </w:tc>
+        <w:tc>
+          <w:tcPr>
+            <w:tcW w:type="dxa" w:w="4638"/>
+            <w:tcMar>
+              <w:top w:type="dxa" w:w="50"/>
+              <w:left w:type="dxa" w:w="90"/>
+              <w:bottom w:type="dxa" w:w="50"/>
+              <w:right w:type="dxa" w:w="90"/>
+            </w:tcMar>
+            <w:vAlign w:val="top"/>
+          </w:tcPr>
+          <w:p>
+            <w:pPr>
+              <w:spacing w:after="0" w:line="252"/>
+              <w:jc w:val="left"/>
+            </w:pPr>
+            <w:r>
+              <w:rPr>
+                <w:b w:val="false"/>
+                <w:bCs w:val="false"/>
+                <w:sz w:val="20"/>
+                <w:szCs w:val="20"/>
+              </w:rPr>
+              <w:t xml:space="preserve">Xavfsiz mehnat usullarini o'qituvchi ko'rsatmasi bilan qo'llaydi, biroq ayrim xavfsizlik talablariga to'liq amal qilmaydi.</w:t>
+            </w:r>
+          </w:p>
+        </w:tc>
+        <w:tc>
+          <w:tcPr>
+            <w:tcW w:type="dxa" w:w="1500"/>
+            <w:shd w:fill="FFF4D6" w:color="auto" w:val="clear"/>
+            <w:tcMar>
+              <w:top w:type="dxa" w:w="50"/>
+              <w:left w:type="dxa" w:w="90"/>
+              <w:bottom w:type="dxa" w:w="50"/>
+              <w:right w:type="dxa" w:w="90"/>
+            </w:tcMar>
+            <w:vAlign w:val="center"/>
+          </w:tcPr>
+          <w:p>
+            <w:pPr>
+              <w:spacing w:after="0" w:line="252"/>
+              <w:jc w:val="center"/>
+            </w:pPr>
+            <w:r>
+              <w:rPr>
+                <w:b/>
+                <w:bCs/>
+                <w:sz w:val="20"/>
+                <w:szCs w:val="20"/>
+              </w:rPr>
+              <w:t xml:space="preserve">3 (qoniqarli)</w:t>
+            </w:r>
+          </w:p>
+        </w:tc>
+      </w:tr>
+      <w:tr>
+        <w:tc>
+          <w:tcPr>
+            <w:vMerge w:val="continue"/>
+          </w:tcPr>
+          <w:p/>
+        </w:tc>
+        <w:tc>
+          <w:tcPr>
+            <w:vMerge w:val="continue"/>
+          </w:tcPr>
+          <w:p/>
+        </w:tc>
+        <w:tc>
+          <w:tcPr>
+            <w:tcW w:type="dxa" w:w="4638"/>
+            <w:tcMar>
+              <w:top w:type="dxa" w:w="50"/>
+              <w:left w:type="dxa" w:w="90"/>
+              <w:bottom w:type="dxa" w:w="50"/>
+              <w:right w:type="dxa" w:w="90"/>
+            </w:tcMar>
+            <w:vAlign w:val="top"/>
+          </w:tcPr>
+          <w:p>
+            <w:pPr>
+              <w:spacing w:after="0" w:line="252"/>
+              <w:jc w:val="left"/>
+            </w:pPr>
+            <w:r>
+              <w:rPr>
+                <w:b w:val="false"/>
+                <w:bCs w:val="false"/>
+                <w:sz w:val="20"/>
+                <w:szCs w:val="20"/>
+              </w:rPr>
+              <w:t xml:space="preserve">Xavfsiz mehnat usullarini mustaqil qo'llaydi, xavfsizlik talablariga asosan amal qiladi, ayrim kichik kamchiliklarga yo'l qo'yadi.</w:t>
+            </w:r>
+          </w:p>
+        </w:tc>
+        <w:tc>
+          <w:tcPr>
+            <w:tcW w:type="dxa" w:w="1500"/>
+            <w:shd w:fill="E5EDF8" w:color="auto" w:val="clear"/>
+            <w:tcMar>
+              <w:top w:type="dxa" w:w="50"/>
+              <w:left w:type="dxa" w:w="90"/>
+              <w:bottom w:type="dxa" w:w="50"/>
+              <w:right w:type="dxa" w:w="90"/>
+            </w:tcMar>
+            <w:vAlign w:val="center"/>
+          </w:tcPr>
+          <w:p>
+            <w:pPr>
+              <w:spacing w:after="0" w:line="252"/>
+              <w:jc w:val="center"/>
+            </w:pPr>
+            <w:r>
+              <w:rPr>
+                <w:b/>
+                <w:bCs/>
+                <w:sz w:val="20"/>
+                <w:szCs w:val="20"/>
+              </w:rPr>
+              <w:t xml:space="preserve">4 (yaxshi)</w:t>
+            </w:r>
+          </w:p>
+        </w:tc>
+      </w:tr>
+      <w:tr>
+        <w:tc>
+          <w:tcPr>
+            <w:vMerge w:val="continue"/>
+          </w:tcPr>
+          <w:p/>
+        </w:tc>
+        <w:tc>
+          <w:tcPr>
+            <w:vMerge w:val="continue"/>
+          </w:tcPr>
+          <w:p/>
+        </w:tc>
+        <w:tc>
+          <w:tcPr>
+            <w:tcW w:type="dxa" w:w="4638"/>
+            <w:tcMar>
+              <w:top w:type="dxa" w:w="50"/>
+              <w:left w:type="dxa" w:w="90"/>
+              <w:bottom w:type="dxa" w:w="50"/>
+              <w:right w:type="dxa" w:w="90"/>
+            </w:tcMar>
+            <w:vAlign w:val="top"/>
+          </w:tcPr>
+          <w:p>
+            <w:pPr>
+              <w:spacing w:after="0" w:line="252"/>
+              <w:jc w:val="left"/>
+            </w:pPr>
+            <w:r>
+              <w:rPr>
+                <w:b w:val="false"/>
+                <w:bCs w:val="false"/>
+                <w:sz w:val="20"/>
+                <w:szCs w:val="20"/>
+              </w:rPr>
+              <w:t xml:space="preserve">Xavfsiz mehnat usullarini to'liq va mustaqil qo'llaydi, barcha xavfsizlik talablariga rioya qiladi hamda ish joyida xavfsiz mehnat madaniyatini namoyon etadi.</w:t>
+            </w:r>
+          </w:p>
+        </w:tc>
+        <w:tc>
+          <w:tcPr>
+            <w:tcW w:type="dxa" w:w="1500"/>
+            <w:shd w:fill="E3F1E3" w:color="auto" w:val="clear"/>
+            <w:tcMar>
+              <w:top w:type="dxa" w:w="50"/>
+              <w:left w:type="dxa" w:w="90"/>
+              <w:bottom w:type="dxa" w:w="50"/>
+              <w:right w:type="dxa" w:w="90"/>
+            </w:tcMar>
+            <w:vAlign w:val="center"/>
+          </w:tcPr>
+          <w:p>
+            <w:pPr>
+              <w:spacing w:after="0" w:line="252"/>
+              <w:jc w:val="center"/>
+            </w:pPr>
+            <w:r>
+              <w:rPr>
+                <w:b/>
+                <w:bCs/>
+                <w:sz w:val="20"/>
+                <w:szCs w:val="20"/>
+              </w:rPr>
+              <w:t xml:space="preserve">5 (a'lo)</w:t>
+            </w:r>
+          </w:p>
+        </w:tc>
+      </w:tr>
+    </w:tbl>
+    <w:p>
+      <w:r>
+        <w:br w:type="page"/>
+      </w:r>
+    </w:p>
+    <w:p>
+      <w:pPr>
+        <w:pStyle w:val="Heading2"/>
+        <w:spacing w:after="140" w:before="240"/>
+      </w:pPr>
+      <w:r>
+        <w:rPr>
+          <w:b/>
+          <w:bCs/>
+          <w:color w:val="2E5496"/>
+          <w:sz w:val="27"/>
+          <w:szCs w:val="27"/>
+        </w:rPr>
+        <w:t xml:space="preserve">2-o'qitish natijasi bo'yicha baholash mezonlari</w:t>
+      </w:r>
+    </w:p>
+    <w:p>
+      <w:pPr>
+        <w:spacing w:after="60" w:before="140"/>
+        <w:jc w:val="left"/>
+      </w:pPr>
+      <w:r>
+        <w:rPr>
+          <w:b/>
+          <w:bCs/>
+          <w:i/>
+          <w:iCs/>
+          <w:color w:val="44546A"/>
+          <w:sz w:val="22"/>
+          <w:szCs w:val="22"/>
+        </w:rPr>
+        <w:t xml:space="preserve">B.2-jadval. Favqulodda vaziyatlar va birinchi tibbiy yordam bo'yicha baholash</w:t>
+      </w:r>
+    </w:p>
+    <w:tbl>
+      <w:tblPr>
+        <w:tblW w:type="dxa" w:w="9638"/>
+        <w:tblBorders>
+          <w:top w:val="single" w:color="auto" w:sz="4"/>
+          <w:left w:val="single" w:color="auto" w:sz="4"/>
+          <w:bottom w:val="single" w:color="auto" w:sz="4"/>
+          <w:right w:val="single" w:color="auto" w:sz="4"/>
+          <w:insideH w:val="single" w:color="auto" w:sz="4"/>
+          <w:insideV w:val="single" w:color="auto" w:sz="4"/>
+        </w:tblBorders>
+      </w:tblPr>
+      <w:tblGrid>
+        <w:gridCol w:w="1750"/>
+        <w:gridCol w:w="1750"/>
+        <w:gridCol w:w="4638"/>
+        <w:gridCol w:w="1500"/>
+      </w:tblGrid>
+      <w:tr>
+        <w:trPr>
+          <w:tblHeader/>
+        </w:trPr>
+        <w:tc>
+          <w:tcPr>
+            <w:tcW w:type="dxa" w:w="1750"/>
+            <w:shd w:fill="1F3864" w:color="auto" w:val="clear"/>
+            <w:tcMar>
+              <w:top w:type="dxa" w:w="40"/>
+              <w:left w:type="dxa" w:w="90"/>
+              <w:bottom w:type="dxa" w:w="40"/>
+              <w:right w:type="dxa" w:w="90"/>
+            </w:tcMar>
+            <w:vAlign w:val="center"/>
+          </w:tcPr>
+          <w:p>
+            <w:pPr>
+              <w:spacing w:after="0" w:line="264"/>
+              <w:jc w:val="center"/>
+            </w:pPr>
+            <w:r>
+              <w:rPr>
+                <w:b/>
+                <w:bCs/>
+                <w:color w:val="FFFFFF"/>
+                <w:sz w:val="22"/>
+                <w:szCs w:val="22"/>
+              </w:rPr>
+              <w:t xml:space="preserve">O'qitish natijasi</w:t>
+            </w:r>
+          </w:p>
+        </w:tc>
+        <w:tc>
+          <w:tcPr>
+            <w:tcW w:type="dxa" w:w="1750"/>
+            <w:shd w:fill="1F3864" w:color="auto" w:val="clear"/>
+            <w:tcMar>
+              <w:top w:type="dxa" w:w="40"/>
+              <w:left w:type="dxa" w:w="90"/>
+              <w:bottom w:type="dxa" w:w="40"/>
+              <w:right w:type="dxa" w:w="90"/>
+            </w:tcMar>
+            <w:vAlign w:val="center"/>
+          </w:tcPr>
+          <w:p>
+            <w:pPr>
+              <w:spacing w:after="0" w:line="264"/>
+              <w:jc w:val="center"/>
+            </w:pPr>
+            <w:r>
+              <w:rPr>
+                <w:b/>
+                <w:bCs/>
+                <w:color w:val="FFFFFF"/>
+                <w:sz w:val="22"/>
+                <w:szCs w:val="22"/>
+              </w:rPr>
+              <w:t xml:space="preserve">Baholash indikatori</w:t>
+            </w:r>
+          </w:p>
+        </w:tc>
+        <w:tc>
+          <w:tcPr>
+            <w:tcW w:type="dxa" w:w="4638"/>
+            <w:shd w:fill="1F3864" w:color="auto" w:val="clear"/>
+            <w:tcMar>
+              <w:top w:type="dxa" w:w="40"/>
+              <w:left w:type="dxa" w:w="90"/>
+              <w:bottom w:type="dxa" w:w="40"/>
+              <w:right w:type="dxa" w:w="90"/>
+            </w:tcMar>
+            <w:vAlign w:val="center"/>
+          </w:tcPr>
+          <w:p>
+            <w:pPr>
+              <w:spacing w:after="0" w:line="264"/>
+              <w:jc w:val="center"/>
+            </w:pPr>
+            <w:r>
+              <w:rPr>
+                <w:b/>
+                <w:bCs/>
+                <w:color w:val="FFFFFF"/>
+                <w:sz w:val="22"/>
+                <w:szCs w:val="22"/>
+              </w:rPr>
+              <w:t xml:space="preserve">Baholashga qo'yilgan kriteriyalar</w:t>
+            </w:r>
+          </w:p>
+        </w:tc>
+        <w:tc>
+          <w:tcPr>
+            <w:tcW w:type="dxa" w:w="1500"/>
+            <w:shd w:fill="1F3864" w:color="auto" w:val="clear"/>
+            <w:tcMar>
+              <w:top w:type="dxa" w:w="40"/>
+              <w:left w:type="dxa" w:w="90"/>
+              <w:bottom w:type="dxa" w:w="40"/>
+              <w:right w:type="dxa" w:w="90"/>
+            </w:tcMar>
+            <w:vAlign w:val="center"/>
+          </w:tcPr>
+          <w:p>
+            <w:pPr>
+              <w:spacing w:after="0" w:line="264"/>
+              <w:jc w:val="center"/>
+            </w:pPr>
+            <w:r>
+              <w:rPr>
+                <w:b/>
+                <w:bCs/>
+                <w:color w:val="FFFFFF"/>
+                <w:sz w:val="22"/>
+                <w:szCs w:val="22"/>
+              </w:rPr>
+              <w:t xml:space="preserve">Baholanishi</w:t>
+            </w:r>
+          </w:p>
+        </w:tc>
+      </w:tr>
+      <w:tr>
+        <w:tc>
+          <w:tcPr>
+            <w:tcW w:type="dxa" w:w="1750"/>
+            <w:vMerge w:val="restart"/>
+            <w:tcMar>
+              <w:top w:type="dxa" w:w="50"/>
+              <w:left w:type="dxa" w:w="90"/>
+              <w:bottom w:type="dxa" w:w="50"/>
+              <w:right w:type="dxa" w:w="90"/>
+            </w:tcMar>
+            <w:vAlign w:val="center"/>
+          </w:tcPr>
+          <w:p>
+            <w:pPr>
+              <w:spacing w:after="0" w:line="252"/>
+              <w:jc w:val="left"/>
+            </w:pPr>
+            <w:r>
+              <w:rPr>
+                <w:b/>
+                <w:bCs/>
+                <w:sz w:val="20"/>
+                <w:szCs w:val="20"/>
+              </w:rPr>
+              <w:t xml:space="preserve">Favqulodda vaziyatlarda xavfsiz harakatlanadi va jabrlanuvchiga birinchi tibbiy yordam ko'rsatadi.</w:t>
+            </w:r>
+          </w:p>
+        </w:tc>
+        <w:tc>
+          <w:tcPr>
+            <w:tcW w:type="dxa" w:w="1750"/>
+            <w:vMerge w:val="restart"/>
+            <w:tcMar>
+              <w:top w:type="dxa" w:w="50"/>
+              <w:left w:type="dxa" w:w="90"/>
+              <w:bottom w:type="dxa" w:w="50"/>
+              <w:right w:type="dxa" w:w="90"/>
+            </w:tcMar>
+            <w:vAlign w:val="center"/>
+          </w:tcPr>
+          <w:p>
+            <w:pPr>
+              <w:spacing w:after="0" w:line="252"/>
+              <w:jc w:val="left"/>
+            </w:pPr>
+            <w:r>
+              <w:rPr>
+                <w:b w:val="false"/>
+                <w:bCs w:val="false"/>
+                <w:sz w:val="20"/>
+                <w:szCs w:val="20"/>
+              </w:rPr>
+              <w:t xml:space="preserve">Favqulodda vaziyatlarda harakatlanish va evakuatsiya tartibini bilish.</w:t>
+            </w:r>
+          </w:p>
+        </w:tc>
+        <w:tc>
+          <w:tcPr>
+            <w:tcW w:type="dxa" w:w="4638"/>
+            <w:tcMar>
+              <w:top w:type="dxa" w:w="50"/>
+              <w:left w:type="dxa" w:w="90"/>
+              <w:bottom w:type="dxa" w:w="50"/>
+              <w:right w:type="dxa" w:w="90"/>
+            </w:tcMar>
+            <w:vAlign w:val="top"/>
+          </w:tcPr>
+          <w:p>
+            <w:pPr>
+              <w:spacing w:after="0" w:line="252"/>
+              <w:jc w:val="left"/>
+            </w:pPr>
+            <w:r>
+              <w:rPr>
+                <w:b w:val="false"/>
+                <w:bCs w:val="false"/>
+                <w:sz w:val="20"/>
+                <w:szCs w:val="20"/>
+              </w:rPr>
+              <w:t xml:space="preserve">Favqulodda vaziyatlarda harakatlanish va evakuatsiya tartibini bilmaydi, xavfsizlik talablarini buzadi.</w:t>
+            </w:r>
+          </w:p>
+        </w:tc>
+        <w:tc>
+          <w:tcPr>
+            <w:tcW w:type="dxa" w:w="1500"/>
+            <w:shd w:fill="FBE2E2" w:color="auto" w:val="clear"/>
+            <w:tcMar>
+              <w:top w:type="dxa" w:w="50"/>
+              <w:left w:type="dxa" w:w="90"/>
+              <w:bottom w:type="dxa" w:w="50"/>
+              <w:right w:type="dxa" w:w="90"/>
+            </w:tcMar>
+            <w:vAlign w:val="center"/>
+          </w:tcPr>
+          <w:p>
+            <w:pPr>
+              <w:spacing w:after="0" w:line="252"/>
+              <w:jc w:val="center"/>
+            </w:pPr>
+            <w:r>
+              <w:rPr>
+                <w:b/>
+                <w:bCs/>
+                <w:sz w:val="20"/>
+                <w:szCs w:val="20"/>
+              </w:rPr>
+              <w:t xml:space="preserve">2 (qoniqarsiz)</w:t>
+            </w:r>
+          </w:p>
+        </w:tc>
+      </w:tr>
+      <w:tr>
+        <w:tc>
+          <w:tcPr>
+            <w:vMerge w:val="continue"/>
+          </w:tcPr>
+          <w:p/>
+        </w:tc>
+        <w:tc>
+          <w:tcPr>
+            <w:vMerge w:val="continue"/>
+          </w:tcPr>
+          <w:p/>
+        </w:tc>
+        <w:tc>
+          <w:tcPr>
+            <w:tcW w:type="dxa" w:w="4638"/>
+            <w:tcMar>
+              <w:top w:type="dxa" w:w="50"/>
+              <w:left w:type="dxa" w:w="90"/>
+              <w:bottom w:type="dxa" w:w="50"/>
+              <w:right w:type="dxa" w:w="90"/>
+            </w:tcMar>
+            <w:vAlign w:val="top"/>
+          </w:tcPr>
+          <w:p>
+            <w:pPr>
+              <w:spacing w:after="0" w:line="252"/>
+              <w:jc w:val="left"/>
+            </w:pPr>
+            <w:r>
+              <w:rPr>
+                <w:b w:val="false"/>
+                <w:bCs w:val="false"/>
+                <w:sz w:val="20"/>
+                <w:szCs w:val="20"/>
+              </w:rPr>
+              <w:t xml:space="preserve">Favqulodda vaziyatlarda harakatlanish tartibini qisman biladi, evakuatsiya yo'llarini ko'rsatadi, biroq ketma-ketlikni to'liq tushuntirmaydi.</w:t>
+            </w:r>
+          </w:p>
+        </w:tc>
+        <w:tc>
+          <w:tcPr>
+            <w:tcW w:type="dxa" w:w="1500"/>
+            <w:shd w:fill="FFF4D6" w:color="auto" w:val="clear"/>
+            <w:tcMar>
+              <w:top w:type="dxa" w:w="50"/>
+              <w:left w:type="dxa" w:w="90"/>
+              <w:bottom w:type="dxa" w:w="50"/>
+              <w:right w:type="dxa" w:w="90"/>
+            </w:tcMar>
+            <w:vAlign w:val="center"/>
+          </w:tcPr>
+          <w:p>
+            <w:pPr>
+              <w:spacing w:after="0" w:line="252"/>
+              <w:jc w:val="center"/>
+            </w:pPr>
+            <w:r>
+              <w:rPr>
+                <w:b/>
+                <w:bCs/>
+                <w:sz w:val="20"/>
+                <w:szCs w:val="20"/>
+              </w:rPr>
+              <w:t xml:space="preserve">3 (qoniqarli)</w:t>
+            </w:r>
+          </w:p>
+        </w:tc>
+      </w:tr>
+      <w:tr>
+        <w:tc>
+          <w:tcPr>
+            <w:vMerge w:val="continue"/>
+          </w:tcPr>
+          <w:p/>
+        </w:tc>
+        <w:tc>
+          <w:tcPr>
+            <w:vMerge w:val="continue"/>
+          </w:tcPr>
+          <w:p/>
+        </w:tc>
+        <w:tc>
+          <w:tcPr>
+            <w:tcW w:type="dxa" w:w="4638"/>
+            <w:tcMar>
+              <w:top w:type="dxa" w:w="50"/>
+              <w:left w:type="dxa" w:w="90"/>
+              <w:bottom w:type="dxa" w:w="50"/>
+              <w:right w:type="dxa" w:w="90"/>
+            </w:tcMar>
+            <w:vAlign w:val="top"/>
+          </w:tcPr>
+          <w:p>
+            <w:pPr>
+              <w:spacing w:after="0" w:line="252"/>
+              <w:jc w:val="left"/>
+            </w:pPr>
+            <w:r>
+              <w:rPr>
+                <w:b w:val="false"/>
+                <w:bCs w:val="false"/>
+                <w:sz w:val="20"/>
+                <w:szCs w:val="20"/>
+              </w:rPr>
+              <w:t xml:space="preserve">Favqulodda vaziyatlarda to'g'ri harakatlanadi va evakuatsiya tartibini izohlaydi, ayrim kichik noaniqliklarga yo'l qo'yadi.</w:t>
+            </w:r>
+          </w:p>
+        </w:tc>
+        <w:tc>
+          <w:tcPr>
+            <w:tcW w:type="dxa" w:w="1500"/>
+            <w:shd w:fill="E5EDF8" w:color="auto" w:val="clear"/>
+            <w:tcMar>
+              <w:top w:type="dxa" w:w="50"/>
+              <w:left w:type="dxa" w:w="90"/>
+              <w:bottom w:type="dxa" w:w="50"/>
+              <w:right w:type="dxa" w:w="90"/>
+            </w:tcMar>
+            <w:vAlign w:val="center"/>
+          </w:tcPr>
+          <w:p>
+            <w:pPr>
+              <w:spacing w:after="0" w:line="252"/>
+              <w:jc w:val="center"/>
+            </w:pPr>
+            <w:r>
+              <w:rPr>
+                <w:b/>
+                <w:bCs/>
+                <w:sz w:val="20"/>
+                <w:szCs w:val="20"/>
+              </w:rPr>
+              <w:t xml:space="preserve">4 (yaxshi)</w:t>
+            </w:r>
+          </w:p>
+        </w:tc>
+      </w:tr>
+      <w:tr>
+        <w:tc>
+          <w:tcPr>
+            <w:vMerge w:val="continue"/>
+          </w:tcPr>
+          <w:p/>
+        </w:tc>
+        <w:tc>
+          <w:tcPr>
+            <w:vMerge w:val="continue"/>
+          </w:tcPr>
+          <w:p/>
+        </w:tc>
+        <w:tc>
+          <w:tcPr>
+            <w:tcW w:type="dxa" w:w="4638"/>
+            <w:tcMar>
+              <w:top w:type="dxa" w:w="50"/>
+              <w:left w:type="dxa" w:w="90"/>
+              <w:bottom w:type="dxa" w:w="50"/>
+              <w:right w:type="dxa" w:w="90"/>
+            </w:tcMar>
+            <w:vAlign w:val="top"/>
+          </w:tcPr>
+          <w:p>
+            <w:pPr>
+              <w:spacing w:after="0" w:line="252"/>
+              <w:jc w:val="left"/>
+            </w:pPr>
+            <w:r>
+              <w:rPr>
+                <w:b w:val="false"/>
+                <w:bCs w:val="false"/>
+                <w:sz w:val="20"/>
+                <w:szCs w:val="20"/>
+              </w:rPr>
+              <w:t xml:space="preserve">Favqulodda vaziyatlarda ketma-ketlikka to'liq rioya qilib harakatlanadi, evakuatsiyani mustaqil tashkil etadi va o'zgalarga yo'l-yo'riq ko'rsatadi.</w:t>
+            </w:r>
+          </w:p>
+        </w:tc>
+        <w:tc>
+          <w:tcPr>
+            <w:tcW w:type="dxa" w:w="1500"/>
+            <w:shd w:fill="E3F1E3" w:color="auto" w:val="clear"/>
+            <w:tcMar>
+              <w:top w:type="dxa" w:w="50"/>
+              <w:left w:type="dxa" w:w="90"/>
+              <w:bottom w:type="dxa" w:w="50"/>
+              <w:right w:type="dxa" w:w="90"/>
+            </w:tcMar>
+            <w:vAlign w:val="center"/>
+          </w:tcPr>
+          <w:p>
+            <w:pPr>
+              <w:spacing w:after="0" w:line="252"/>
+              <w:jc w:val="center"/>
+            </w:pPr>
+            <w:r>
+              <w:rPr>
+                <w:b/>
+                <w:bCs/>
+                <w:sz w:val="20"/>
+                <w:szCs w:val="20"/>
+              </w:rPr>
+              <w:t xml:space="preserve">5 (a'lo)</w:t>
+            </w:r>
+          </w:p>
+        </w:tc>
+      </w:tr>
+      <w:tr>
+        <w:tc>
+          <w:tcPr>
+            <w:vMerge w:val="continue"/>
+          </w:tcPr>
+          <w:p/>
+        </w:tc>
+        <w:tc>
+          <w:tcPr>
+            <w:tcW w:type="dxa" w:w="1750"/>
+            <w:vMerge w:val="restart"/>
+            <w:tcMar>
+              <w:top w:type="dxa" w:w="50"/>
+              <w:left w:type="dxa" w:w="90"/>
+              <w:bottom w:type="dxa" w:w="50"/>
+              <w:right w:type="dxa" w:w="90"/>
+            </w:tcMar>
+            <w:vAlign w:val="center"/>
+          </w:tcPr>
+          <w:p>
+            <w:pPr>
+              <w:spacing w:after="0" w:line="252"/>
+              <w:jc w:val="left"/>
+            </w:pPr>
+            <w:r>
+              <w:rPr>
+                <w:b w:val="false"/>
+                <w:bCs w:val="false"/>
+                <w:sz w:val="20"/>
+                <w:szCs w:val="20"/>
+              </w:rPr>
+              <w:t xml:space="preserve">Birinchi tibbiy yordam ko'rsatish ko'nikmasi.</w:t>
+            </w:r>
+          </w:p>
+        </w:tc>
+        <w:tc>
+          <w:tcPr>
+            <w:tcW w:type="dxa" w:w="4638"/>
+            <w:tcMar>
+              <w:top w:type="dxa" w:w="50"/>
+              <w:left w:type="dxa" w:w="90"/>
+              <w:bottom w:type="dxa" w:w="50"/>
+              <w:right w:type="dxa" w:w="90"/>
+            </w:tcMar>
+            <w:vAlign w:val="top"/>
+          </w:tcPr>
+          <w:p>
+            <w:pPr>
+              <w:spacing w:after="0" w:line="252"/>
+              <w:jc w:val="left"/>
+            </w:pPr>
+            <w:r>
+              <w:rPr>
+                <w:b w:val="false"/>
+                <w:bCs w:val="false"/>
+                <w:sz w:val="20"/>
+                <w:szCs w:val="20"/>
+              </w:rPr>
+              <w:t xml:space="preserve">Birinchi tibbiy yordam ko'rsatish asoslarini bilmaydi yoki noto'g'ri harakat qiladi.</w:t>
+            </w:r>
+          </w:p>
+        </w:tc>
+        <w:tc>
+          <w:tcPr>
+            <w:tcW w:type="dxa" w:w="1500"/>
+            <w:shd w:fill="FBE2E2" w:color="auto" w:val="clear"/>
+            <w:tcMar>
+              <w:top w:type="dxa" w:w="50"/>
+              <w:left w:type="dxa" w:w="90"/>
+              <w:bottom w:type="dxa" w:w="50"/>
+              <w:right w:type="dxa" w:w="90"/>
+            </w:tcMar>
+            <w:vAlign w:val="center"/>
+          </w:tcPr>
+          <w:p>
+            <w:pPr>
+              <w:spacing w:after="0" w:line="252"/>
+              <w:jc w:val="center"/>
+            </w:pPr>
+            <w:r>
+              <w:rPr>
+                <w:b/>
+                <w:bCs/>
+                <w:sz w:val="20"/>
+                <w:szCs w:val="20"/>
+              </w:rPr>
+              <w:t xml:space="preserve">2 (qoniqarsiz)</w:t>
+            </w:r>
+          </w:p>
+        </w:tc>
+      </w:tr>
+      <w:tr>
+        <w:tc>
+          <w:tcPr>
+            <w:vMerge w:val="continue"/>
+          </w:tcPr>
+          <w:p/>
+        </w:tc>
+        <w:tc>
+          <w:tcPr>
+            <w:vMerge w:val="continue"/>
+          </w:tcPr>
+          <w:p/>
+        </w:tc>
+        <w:tc>
+          <w:tcPr>
+            <w:tcW w:type="dxa" w:w="4638"/>
+            <w:tcMar>
+              <w:top w:type="dxa" w:w="50"/>
+              <w:left w:type="dxa" w:w="90"/>
+              <w:bottom w:type="dxa" w:w="50"/>
+              <w:right w:type="dxa" w:w="90"/>
+            </w:tcMar>
+            <w:vAlign w:val="top"/>
+          </w:tcPr>
+          <w:p>
+            <w:pPr>
+              <w:spacing w:after="0" w:line="252"/>
+              <w:jc w:val="left"/>
+            </w:pPr>
+            <w:r>
+              <w:rPr>
+                <w:b w:val="false"/>
+                <w:bCs w:val="false"/>
+                <w:sz w:val="20"/>
+                <w:szCs w:val="20"/>
+              </w:rPr>
+              <w:t xml:space="preserve">Birinchi tibbiy yordamni qisman ko'rsatadi, ayrim holatlarda to'g'ri harakat qiladi, biroq ketma-ketlikni buzadi.</w:t>
+            </w:r>
+          </w:p>
+        </w:tc>
+        <w:tc>
+          <w:tcPr>
+            <w:tcW w:type="dxa" w:w="1500"/>
+            <w:shd w:fill="FFF4D6" w:color="auto" w:val="clear"/>
+            <w:tcMar>
+              <w:top w:type="dxa" w:w="50"/>
+              <w:left w:type="dxa" w:w="90"/>
+              <w:bottom w:type="dxa" w:w="50"/>
+              <w:right w:type="dxa" w:w="90"/>
+            </w:tcMar>
+            <w:vAlign w:val="center"/>
+          </w:tcPr>
+          <w:p>
+            <w:pPr>
+              <w:spacing w:after="0" w:line="252"/>
+              <w:jc w:val="center"/>
+            </w:pPr>
+            <w:r>
+              <w:rPr>
+                <w:b/>
+                <w:bCs/>
+                <w:sz w:val="20"/>
+                <w:szCs w:val="20"/>
+              </w:rPr>
+              <w:t xml:space="preserve">3 (qoniqarli)</w:t>
+            </w:r>
+          </w:p>
+        </w:tc>
+      </w:tr>
+      <w:tr>
+        <w:tc>
+          <w:tcPr>
+            <w:vMerge w:val="continue"/>
+          </w:tcPr>
+          <w:p/>
+        </w:tc>
+        <w:tc>
+          <w:tcPr>
+            <w:vMerge w:val="continue"/>
+          </w:tcPr>
+          <w:p/>
+        </w:tc>
+        <w:tc>
+          <w:tcPr>
+            <w:tcW w:type="dxa" w:w="4638"/>
+            <w:tcMar>
+              <w:top w:type="dxa" w:w="50"/>
+              <w:left w:type="dxa" w:w="90"/>
+              <w:bottom w:type="dxa" w:w="50"/>
+              <w:right w:type="dxa" w:w="90"/>
+            </w:tcMar>
+            <w:vAlign w:val="top"/>
+          </w:tcPr>
+          <w:p>
+            <w:pPr>
+              <w:spacing w:after="0" w:line="252"/>
+              <w:jc w:val="left"/>
+            </w:pPr>
+            <w:r>
+              <w:rPr>
+                <w:b w:val="false"/>
+                <w:bCs w:val="false"/>
+                <w:sz w:val="20"/>
+                <w:szCs w:val="20"/>
+              </w:rPr>
+              <w:t xml:space="preserve">Birinchi tibbiy yordamni to'g'ri ko'rsatadi, asosiy holatlarda mustaqil harakat qiladi, ayrim kamchiliklarga yo'l qo'yadi.</w:t>
+            </w:r>
+          </w:p>
+        </w:tc>
+        <w:tc>
+          <w:tcPr>
+            <w:tcW w:type="dxa" w:w="1500"/>
+            <w:shd w:fill="E5EDF8" w:color="auto" w:val="clear"/>
+            <w:tcMar>
+              <w:top w:type="dxa" w:w="50"/>
+              <w:left w:type="dxa" w:w="90"/>
+              <w:bottom w:type="dxa" w:w="50"/>
+              <w:right w:type="dxa" w:w="90"/>
+            </w:tcMar>
+            <w:vAlign w:val="center"/>
+          </w:tcPr>
+          <w:p>
+            <w:pPr>
+              <w:spacing w:after="0" w:line="252"/>
+              <w:jc w:val="center"/>
+            </w:pPr>
+            <w:r>
+              <w:rPr>
+                <w:b/>
+                <w:bCs/>
+                <w:sz w:val="20"/>
+                <w:szCs w:val="20"/>
+              </w:rPr>
+              <w:t xml:space="preserve">4 (yaxshi)</w:t>
+            </w:r>
+          </w:p>
+        </w:tc>
+      </w:tr>
+      <w:tr>
+        <w:tc>
+          <w:tcPr>
+            <w:vMerge w:val="continue"/>
+          </w:tcPr>
+          <w:p/>
+        </w:tc>
+        <w:tc>
+          <w:tcPr>
+            <w:vMerge w:val="continue"/>
+          </w:tcPr>
+          <w:p/>
+        </w:tc>
+        <w:tc>
+          <w:tcPr>
+            <w:tcW w:type="dxa" w:w="4638"/>
+            <w:tcMar>
+              <w:top w:type="dxa" w:w="50"/>
+              <w:left w:type="dxa" w:w="90"/>
+              <w:bottom w:type="dxa" w:w="50"/>
+              <w:right w:type="dxa" w:w="90"/>
+            </w:tcMar>
+            <w:vAlign w:val="top"/>
+          </w:tcPr>
+          <w:p>
+            <w:pPr>
+              <w:spacing w:after="0" w:line="252"/>
+              <w:jc w:val="left"/>
+            </w:pPr>
+            <w:r>
+              <w:rPr>
+                <w:b w:val="false"/>
+                <w:bCs w:val="false"/>
+                <w:sz w:val="20"/>
+                <w:szCs w:val="20"/>
+              </w:rPr>
+              <w:t xml:space="preserve">Birinchi tibbiy yordamni to'liq va to'g'ri ketma-ketlikda ko'rsatadi, turli holatlarda mustaqil va ishonchli harakat qiladi.</w:t>
+            </w:r>
+          </w:p>
+        </w:tc>
+        <w:tc>
+          <w:tcPr>
+            <w:tcW w:type="dxa" w:w="1500"/>
+            <w:shd w:fill="E3F1E3" w:color="auto" w:val="clear"/>
+            <w:tcMar>
+              <w:top w:type="dxa" w:w="50"/>
+              <w:left w:type="dxa" w:w="90"/>
+              <w:bottom w:type="dxa" w:w="50"/>
+              <w:right w:type="dxa" w:w="90"/>
+            </w:tcMar>
+            <w:vAlign w:val="center"/>
+          </w:tcPr>
+          <w:p>
+            <w:pPr>
+              <w:spacing w:after="0" w:line="252"/>
+              <w:jc w:val="center"/>
+            </w:pPr>
+            <w:r>
+              <w:rPr>
+                <w:b/>
+                <w:bCs/>
+                <w:sz w:val="20"/>
+                <w:szCs w:val="20"/>
+              </w:rPr>
+              <w:t xml:space="preserve">5 (a'lo)</w:t>
+            </w:r>
+          </w:p>
+        </w:tc>
+      </w:tr>
+    </w:tbl>
+    <w:p>
+      <w:r>
+        <w:br w:type="page"/>
+      </w:r>
+    </w:p>
+    <w:p>
+      <w:pPr>
+        <w:pStyle w:val="Heading2"/>
+        <w:spacing w:after="140" w:before="240"/>
+      </w:pPr>
+      <w:r>
+        <w:rPr>
+          <w:b/>
+          <w:bCs/>
+          <w:color w:val="2E5496"/>
+          <w:sz w:val="27"/>
+          <w:szCs w:val="27"/>
+        </w:rPr>
+        <w:t xml:space="preserve">3-o'qitish natijasi bo'yicha baholash mezonlari</w:t>
+      </w:r>
+    </w:p>
+    <w:p>
+      <w:pPr>
+        <w:spacing w:after="60" w:before="140"/>
+        <w:jc w:val="left"/>
+      </w:pPr>
+      <w:r>
+        <w:rPr>
+          <w:b/>
+          <w:bCs/>
+          <w:i/>
+          <w:iCs/>
+          <w:color w:val="44546A"/>
+          <w:sz w:val="22"/>
+          <w:szCs w:val="22"/>
+        </w:rPr>
+        <w:t xml:space="preserve">B.3-jadval. Himoya vositalari va ishlab chiqarish omillari bo'yicha baholash</w:t>
+      </w:r>
+    </w:p>
+    <w:tbl>
+      <w:tblPr>
+        <w:tblW w:type="dxa" w:w="9638"/>
+        <w:tblBorders>
+          <w:top w:val="single" w:color="auto" w:sz="4"/>
+          <w:left w:val="single" w:color="auto" w:sz="4"/>
+          <w:bottom w:val="single" w:color="auto" w:sz="4"/>
+          <w:right w:val="single" w:color="auto" w:sz="4"/>
+          <w:insideH w:val="single" w:color="auto" w:sz="4"/>
+          <w:insideV w:val="single" w:color="auto" w:sz="4"/>
+        </w:tblBorders>
+      </w:tblPr>
+      <w:tblGrid>
+        <w:gridCol w:w="1750"/>
+        <w:gridCol w:w="1750"/>
+        <w:gridCol w:w="4638"/>
+        <w:gridCol w:w="1500"/>
+      </w:tblGrid>
+      <w:tr>
+        <w:trPr>
+          <w:tblHeader/>
+        </w:trPr>
+        <w:tc>
+          <w:tcPr>
+            <w:tcW w:type="dxa" w:w="1750"/>
+            <w:shd w:fill="1F3864" w:color="auto" w:val="clear"/>
+            <w:tcMar>
+              <w:top w:type="dxa" w:w="40"/>
+              <w:left w:type="dxa" w:w="90"/>
+              <w:bottom w:type="dxa" w:w="40"/>
+              <w:right w:type="dxa" w:w="90"/>
+            </w:tcMar>
+            <w:vAlign w:val="center"/>
+          </w:tcPr>
+          <w:p>
+            <w:pPr>
+              <w:spacing w:after="0" w:line="264"/>
+              <w:jc w:val="center"/>
+            </w:pPr>
+            <w:r>
+              <w:rPr>
+                <w:b/>
+                <w:bCs/>
+                <w:color w:val="FFFFFF"/>
+                <w:sz w:val="22"/>
+                <w:szCs w:val="22"/>
+              </w:rPr>
+              <w:t xml:space="preserve">O'qitish natijasi</w:t>
+            </w:r>
+          </w:p>
+        </w:tc>
+        <w:tc>
+          <w:tcPr>
+            <w:tcW w:type="dxa" w:w="1750"/>
+            <w:shd w:fill="1F3864" w:color="auto" w:val="clear"/>
+            <w:tcMar>
+              <w:top w:type="dxa" w:w="40"/>
+              <w:left w:type="dxa" w:w="90"/>
+              <w:bottom w:type="dxa" w:w="40"/>
+              <w:right w:type="dxa" w:w="90"/>
+            </w:tcMar>
+            <w:vAlign w:val="center"/>
+          </w:tcPr>
+          <w:p>
+            <w:pPr>
+              <w:spacing w:after="0" w:line="264"/>
+              <w:jc w:val="center"/>
+            </w:pPr>
+            <w:r>
+              <w:rPr>
+                <w:b/>
+                <w:bCs/>
+                <w:color w:val="FFFFFF"/>
+                <w:sz w:val="22"/>
+                <w:szCs w:val="22"/>
+              </w:rPr>
+              <w:t xml:space="preserve">Baholash indikatori</w:t>
+            </w:r>
+          </w:p>
+        </w:tc>
+        <w:tc>
+          <w:tcPr>
+            <w:tcW w:type="dxa" w:w="4638"/>
+            <w:shd w:fill="1F3864" w:color="auto" w:val="clear"/>
+            <w:tcMar>
+              <w:top w:type="dxa" w:w="40"/>
+              <w:left w:type="dxa" w:w="90"/>
+              <w:bottom w:type="dxa" w:w="40"/>
+              <w:right w:type="dxa" w:w="90"/>
+            </w:tcMar>
+            <w:vAlign w:val="center"/>
+          </w:tcPr>
+          <w:p>
+            <w:pPr>
+              <w:spacing w:after="0" w:line="264"/>
+              <w:jc w:val="center"/>
+            </w:pPr>
+            <w:r>
+              <w:rPr>
+                <w:b/>
+                <w:bCs/>
+                <w:color w:val="FFFFFF"/>
+                <w:sz w:val="22"/>
+                <w:szCs w:val="22"/>
+              </w:rPr>
+              <w:t xml:space="preserve">Baholashga qo'yilgan kriteriyalar</w:t>
+            </w:r>
+          </w:p>
+        </w:tc>
+        <w:tc>
+          <w:tcPr>
+            <w:tcW w:type="dxa" w:w="1500"/>
+            <w:shd w:fill="1F3864" w:color="auto" w:val="clear"/>
+            <w:tcMar>
+              <w:top w:type="dxa" w:w="40"/>
+              <w:left w:type="dxa" w:w="90"/>
+              <w:bottom w:type="dxa" w:w="40"/>
+              <w:right w:type="dxa" w:w="90"/>
+            </w:tcMar>
+            <w:vAlign w:val="center"/>
+          </w:tcPr>
+          <w:p>
+            <w:pPr>
+              <w:spacing w:after="0" w:line="264"/>
+              <w:jc w:val="center"/>
+            </w:pPr>
+            <w:r>
+              <w:rPr>
+                <w:b/>
+                <w:bCs/>
+                <w:color w:val="FFFFFF"/>
+                <w:sz w:val="22"/>
+                <w:szCs w:val="22"/>
+              </w:rPr>
+              <w:t xml:space="preserve">Baholanishi</w:t>
+            </w:r>
+          </w:p>
+        </w:tc>
+      </w:tr>
+      <w:tr>
+        <w:tc>
+          <w:tcPr>
+            <w:tcW w:type="dxa" w:w="1750"/>
+            <w:vMerge w:val="restart"/>
+            <w:tcMar>
+              <w:top w:type="dxa" w:w="50"/>
+              <w:left w:type="dxa" w:w="90"/>
+              <w:bottom w:type="dxa" w:w="50"/>
+              <w:right w:type="dxa" w:w="90"/>
+            </w:tcMar>
+            <w:vAlign w:val="center"/>
+          </w:tcPr>
+          <w:p>
+            <w:pPr>
+              <w:spacing w:after="0" w:line="252"/>
+              <w:jc w:val="left"/>
+            </w:pPr>
+            <w:r>
+              <w:rPr>
+                <w:b/>
+                <w:bCs/>
+                <w:sz w:val="20"/>
+                <w:szCs w:val="20"/>
+              </w:rPr>
+              <w:t xml:space="preserve">Shaxsiy va jamoaviy himoya vositalaridan to'g'ri foydalanadi hamda zararli va xavfli ishlab chiqarish omillarini baholaydi.</w:t>
+            </w:r>
+          </w:p>
+        </w:tc>
+        <w:tc>
+          <w:tcPr>
+            <w:tcW w:type="dxa" w:w="1750"/>
+            <w:vMerge w:val="restart"/>
+            <w:tcMar>
+              <w:top w:type="dxa" w:w="50"/>
+              <w:left w:type="dxa" w:w="90"/>
+              <w:bottom w:type="dxa" w:w="50"/>
+              <w:right w:type="dxa" w:w="90"/>
+            </w:tcMar>
+            <w:vAlign w:val="center"/>
+          </w:tcPr>
+          <w:p>
+            <w:pPr>
+              <w:spacing w:after="0" w:line="252"/>
+              <w:jc w:val="left"/>
+            </w:pPr>
+            <w:r>
+              <w:rPr>
+                <w:b w:val="false"/>
+                <w:bCs w:val="false"/>
+                <w:sz w:val="20"/>
+                <w:szCs w:val="20"/>
+              </w:rPr>
+              <w:t xml:space="preserve">Shaxsiy himoya vositalarini tanlash va qo'llash.</w:t>
+            </w:r>
+          </w:p>
+        </w:tc>
+        <w:tc>
+          <w:tcPr>
+            <w:tcW w:type="dxa" w:w="4638"/>
+            <w:tcMar>
+              <w:top w:type="dxa" w:w="50"/>
+              <w:left w:type="dxa" w:w="90"/>
+              <w:bottom w:type="dxa" w:w="50"/>
+              <w:right w:type="dxa" w:w="90"/>
+            </w:tcMar>
+            <w:vAlign w:val="top"/>
+          </w:tcPr>
+          <w:p>
+            <w:pPr>
+              <w:spacing w:after="0" w:line="252"/>
+              <w:jc w:val="left"/>
+            </w:pPr>
+            <w:r>
+              <w:rPr>
+                <w:b w:val="false"/>
+                <w:bCs w:val="false"/>
+                <w:sz w:val="20"/>
+                <w:szCs w:val="20"/>
+              </w:rPr>
+              <w:t xml:space="preserve">Himoya vositalarini tanlay olmaydi yoki ulardan noto'g'ri foydalanadi.</w:t>
+            </w:r>
+          </w:p>
+        </w:tc>
+        <w:tc>
+          <w:tcPr>
+            <w:tcW w:type="dxa" w:w="1500"/>
+            <w:shd w:fill="FBE2E2" w:color="auto" w:val="clear"/>
+            <w:tcMar>
+              <w:top w:type="dxa" w:w="50"/>
+              <w:left w:type="dxa" w:w="90"/>
+              <w:bottom w:type="dxa" w:w="50"/>
+              <w:right w:type="dxa" w:w="90"/>
+            </w:tcMar>
+            <w:vAlign w:val="center"/>
+          </w:tcPr>
+          <w:p>
+            <w:pPr>
+              <w:spacing w:after="0" w:line="252"/>
+              <w:jc w:val="center"/>
+            </w:pPr>
+            <w:r>
+              <w:rPr>
+                <w:b/>
+                <w:bCs/>
+                <w:sz w:val="20"/>
+                <w:szCs w:val="20"/>
+              </w:rPr>
+              <w:t xml:space="preserve">2 (qoniqarsiz)</w:t>
+            </w:r>
+          </w:p>
+        </w:tc>
+      </w:tr>
+      <w:tr>
+        <w:tc>
+          <w:tcPr>
+            <w:vMerge w:val="continue"/>
+          </w:tcPr>
+          <w:p/>
+        </w:tc>
+        <w:tc>
+          <w:tcPr>
+            <w:vMerge w:val="continue"/>
+          </w:tcPr>
+          <w:p/>
+        </w:tc>
+        <w:tc>
+          <w:tcPr>
+            <w:tcW w:type="dxa" w:w="4638"/>
+            <w:tcMar>
+              <w:top w:type="dxa" w:w="50"/>
+              <w:left w:type="dxa" w:w="90"/>
+              <w:bottom w:type="dxa" w:w="50"/>
+              <w:right w:type="dxa" w:w="90"/>
+            </w:tcMar>
+            <w:vAlign w:val="top"/>
+          </w:tcPr>
+          <w:p>
+            <w:pPr>
+              <w:spacing w:after="0" w:line="252"/>
+              <w:jc w:val="left"/>
+            </w:pPr>
+            <w:r>
+              <w:rPr>
+                <w:b w:val="false"/>
+                <w:bCs w:val="false"/>
+                <w:sz w:val="20"/>
+                <w:szCs w:val="20"/>
+              </w:rPr>
+              <w:t xml:space="preserve">Himoya vositalarini qisman to'g'ri tanlaydi, foydalanadi, biroq ayrim hollarda xato qiladi.</w:t>
+            </w:r>
+          </w:p>
+        </w:tc>
+        <w:tc>
+          <w:tcPr>
+            <w:tcW w:type="dxa" w:w="1500"/>
+            <w:shd w:fill="FFF4D6" w:color="auto" w:val="clear"/>
+            <w:tcMar>
+              <w:top w:type="dxa" w:w="50"/>
+              <w:left w:type="dxa" w:w="90"/>
+              <w:bottom w:type="dxa" w:w="50"/>
+              <w:right w:type="dxa" w:w="90"/>
+            </w:tcMar>
+            <w:vAlign w:val="center"/>
+          </w:tcPr>
+          <w:p>
+            <w:pPr>
+              <w:spacing w:after="0" w:line="252"/>
+              <w:jc w:val="center"/>
+            </w:pPr>
+            <w:r>
+              <w:rPr>
+                <w:b/>
+                <w:bCs/>
+                <w:sz w:val="20"/>
+                <w:szCs w:val="20"/>
+              </w:rPr>
+              <w:t xml:space="preserve">3 (qoniqarli)</w:t>
+            </w:r>
+          </w:p>
+        </w:tc>
+      </w:tr>
+      <w:tr>
+        <w:tc>
+          <w:tcPr>
+            <w:vMerge w:val="continue"/>
+          </w:tcPr>
+          <w:p/>
+        </w:tc>
+        <w:tc>
+          <w:tcPr>
+            <w:vMerge w:val="continue"/>
+          </w:tcPr>
+          <w:p/>
+        </w:tc>
+        <w:tc>
+          <w:tcPr>
+            <w:tcW w:type="dxa" w:w="4638"/>
+            <w:tcMar>
+              <w:top w:type="dxa" w:w="50"/>
+              <w:left w:type="dxa" w:w="90"/>
+              <w:bottom w:type="dxa" w:w="50"/>
+              <w:right w:type="dxa" w:w="90"/>
+            </w:tcMar>
+            <w:vAlign w:val="top"/>
+          </w:tcPr>
+          <w:p>
+            <w:pPr>
+              <w:spacing w:after="0" w:line="252"/>
+              <w:jc w:val="left"/>
+            </w:pPr>
+            <w:r>
+              <w:rPr>
+                <w:b w:val="false"/>
+                <w:bCs w:val="false"/>
+                <w:sz w:val="20"/>
+                <w:szCs w:val="20"/>
+              </w:rPr>
+              <w:t xml:space="preserve">Himoya vositalarini ish turiga mos tanlaydi va to'g'ri qo'llaydi, ayrim kichik kamchiliklarga yo'l qo'yadi.</w:t>
+            </w:r>
+          </w:p>
+        </w:tc>
+        <w:tc>
+          <w:tcPr>
+            <w:tcW w:type="dxa" w:w="1500"/>
+            <w:shd w:fill="E5EDF8" w:color="auto" w:val="clear"/>
+            <w:tcMar>
+              <w:top w:type="dxa" w:w="50"/>
+              <w:left w:type="dxa" w:w="90"/>
+              <w:bottom w:type="dxa" w:w="50"/>
+              <w:right w:type="dxa" w:w="90"/>
+            </w:tcMar>
+            <w:vAlign w:val="center"/>
+          </w:tcPr>
+          <w:p>
+            <w:pPr>
+              <w:spacing w:after="0" w:line="252"/>
+              <w:jc w:val="center"/>
+            </w:pPr>
+            <w:r>
+              <w:rPr>
+                <w:b/>
+                <w:bCs/>
+                <w:sz w:val="20"/>
+                <w:szCs w:val="20"/>
+              </w:rPr>
+              <w:t xml:space="preserve">4 (yaxshi)</w:t>
+            </w:r>
+          </w:p>
+        </w:tc>
+      </w:tr>
+      <w:tr>
+        <w:tc>
+          <w:tcPr>
+            <w:vMerge w:val="continue"/>
+          </w:tcPr>
+          <w:p/>
+        </w:tc>
+        <w:tc>
+          <w:tcPr>
+            <w:vMerge w:val="continue"/>
+          </w:tcPr>
+          <w:p/>
+        </w:tc>
+        <w:tc>
+          <w:tcPr>
+            <w:tcW w:type="dxa" w:w="4638"/>
+            <w:tcMar>
+              <w:top w:type="dxa" w:w="50"/>
+              <w:left w:type="dxa" w:w="90"/>
+              <w:bottom w:type="dxa" w:w="50"/>
+              <w:right w:type="dxa" w:w="90"/>
+            </w:tcMar>
+            <w:vAlign w:val="top"/>
+          </w:tcPr>
+          <w:p>
+            <w:pPr>
+              <w:spacing w:after="0" w:line="252"/>
+              <w:jc w:val="left"/>
+            </w:pPr>
+            <w:r>
+              <w:rPr>
+                <w:b w:val="false"/>
+                <w:bCs w:val="false"/>
+                <w:sz w:val="20"/>
+                <w:szCs w:val="20"/>
+              </w:rPr>
+              <w:t xml:space="preserve">Himoya vositalarini har bir omilga mos to'g'ri tanlaydi, mustaqil va to'g'ri qo'llaydi hamda tanlovini asoslaydi.</w:t>
+            </w:r>
+          </w:p>
+        </w:tc>
+        <w:tc>
+          <w:tcPr>
+            <w:tcW w:type="dxa" w:w="1500"/>
+            <w:shd w:fill="E3F1E3" w:color="auto" w:val="clear"/>
+            <w:tcMar>
+              <w:top w:type="dxa" w:w="50"/>
+              <w:left w:type="dxa" w:w="90"/>
+              <w:bottom w:type="dxa" w:w="50"/>
+              <w:right w:type="dxa" w:w="90"/>
+            </w:tcMar>
+            <w:vAlign w:val="center"/>
+          </w:tcPr>
+          <w:p>
+            <w:pPr>
+              <w:spacing w:after="0" w:line="252"/>
+              <w:jc w:val="center"/>
+            </w:pPr>
+            <w:r>
+              <w:rPr>
+                <w:b/>
+                <w:bCs/>
+                <w:sz w:val="20"/>
+                <w:szCs w:val="20"/>
+              </w:rPr>
+              <w:t xml:space="preserve">5 (a'lo)</w:t>
+            </w:r>
+          </w:p>
+        </w:tc>
+      </w:tr>
+      <w:tr>
+        <w:tc>
+          <w:tcPr>
+            <w:vMerge w:val="continue"/>
+          </w:tcPr>
+          <w:p/>
+        </w:tc>
+        <w:tc>
+          <w:tcPr>
+            <w:tcW w:type="dxa" w:w="1750"/>
+            <w:vMerge w:val="restart"/>
+            <w:tcMar>
+              <w:top w:type="dxa" w:w="50"/>
+              <w:left w:type="dxa" w:w="90"/>
+              <w:bottom w:type="dxa" w:w="50"/>
+              <w:right w:type="dxa" w:w="90"/>
+            </w:tcMar>
+            <w:vAlign w:val="center"/>
+          </w:tcPr>
+          <w:p>
+            <w:pPr>
+              <w:spacing w:after="0" w:line="252"/>
+              <w:jc w:val="left"/>
+            </w:pPr>
+            <w:r>
+              <w:rPr>
+                <w:b w:val="false"/>
+                <w:bCs w:val="false"/>
+                <w:sz w:val="20"/>
+                <w:szCs w:val="20"/>
+              </w:rPr>
+              <w:t xml:space="preserve">Zararli va xavfli omillarni aniqlash va baholash.</w:t>
+            </w:r>
+          </w:p>
+        </w:tc>
+        <w:tc>
+          <w:tcPr>
+            <w:tcW w:type="dxa" w:w="4638"/>
+            <w:tcMar>
+              <w:top w:type="dxa" w:w="50"/>
+              <w:left w:type="dxa" w:w="90"/>
+              <w:bottom w:type="dxa" w:w="50"/>
+              <w:right w:type="dxa" w:w="90"/>
+            </w:tcMar>
+            <w:vAlign w:val="top"/>
+          </w:tcPr>
+          <w:p>
+            <w:pPr>
+              <w:spacing w:after="0" w:line="252"/>
+              <w:jc w:val="left"/>
+            </w:pPr>
+            <w:r>
+              <w:rPr>
+                <w:b w:val="false"/>
+                <w:bCs w:val="false"/>
+                <w:sz w:val="20"/>
+                <w:szCs w:val="20"/>
+              </w:rPr>
+              <w:t xml:space="preserve">Zararli va xavfli omillarni farqlay olmaydi, ularning ta'sirini tushuntirmaydi.</w:t>
+            </w:r>
+          </w:p>
+        </w:tc>
+        <w:tc>
+          <w:tcPr>
+            <w:tcW w:type="dxa" w:w="1500"/>
+            <w:shd w:fill="FBE2E2" w:color="auto" w:val="clear"/>
+            <w:tcMar>
+              <w:top w:type="dxa" w:w="50"/>
+              <w:left w:type="dxa" w:w="90"/>
+              <w:bottom w:type="dxa" w:w="50"/>
+              <w:right w:type="dxa" w:w="90"/>
+            </w:tcMar>
+            <w:vAlign w:val="center"/>
+          </w:tcPr>
+          <w:p>
+            <w:pPr>
+              <w:spacing w:after="0" w:line="252"/>
+              <w:jc w:val="center"/>
+            </w:pPr>
+            <w:r>
+              <w:rPr>
+                <w:b/>
+                <w:bCs/>
+                <w:sz w:val="20"/>
+                <w:szCs w:val="20"/>
+              </w:rPr>
+              <w:t xml:space="preserve">2 (qoniqarsiz)</w:t>
+            </w:r>
+          </w:p>
+        </w:tc>
+      </w:tr>
+      <w:tr>
+        <w:tc>
+          <w:tcPr>
+            <w:vMerge w:val="continue"/>
+          </w:tcPr>
+          <w:p/>
+        </w:tc>
+        <w:tc>
+          <w:tcPr>
+            <w:vMerge w:val="continue"/>
+          </w:tcPr>
+          <w:p/>
+        </w:tc>
+        <w:tc>
+          <w:tcPr>
+            <w:tcW w:type="dxa" w:w="4638"/>
+            <w:tcMar>
+              <w:top w:type="dxa" w:w="50"/>
+              <w:left w:type="dxa" w:w="90"/>
+              <w:bottom w:type="dxa" w:w="50"/>
+              <w:right w:type="dxa" w:w="90"/>
+            </w:tcMar>
+            <w:vAlign w:val="top"/>
+          </w:tcPr>
+          <w:p>
+            <w:pPr>
+              <w:spacing w:after="0" w:line="252"/>
+              <w:jc w:val="left"/>
+            </w:pPr>
+            <w:r>
+              <w:rPr>
+                <w:b w:val="false"/>
+                <w:bCs w:val="false"/>
+                <w:sz w:val="20"/>
+                <w:szCs w:val="20"/>
+              </w:rPr>
+              <w:t xml:space="preserve">Ayrim omillarni aniqlaydi, biroq ularni tasniflashda va baholashda xatoliklarga yo'l qo'yadi.</w:t>
+            </w:r>
+          </w:p>
+        </w:tc>
+        <w:tc>
+          <w:tcPr>
+            <w:tcW w:type="dxa" w:w="1500"/>
+            <w:shd w:fill="FFF4D6" w:color="auto" w:val="clear"/>
+            <w:tcMar>
+              <w:top w:type="dxa" w:w="50"/>
+              <w:left w:type="dxa" w:w="90"/>
+              <w:bottom w:type="dxa" w:w="50"/>
+              <w:right w:type="dxa" w:w="90"/>
+            </w:tcMar>
+            <w:vAlign w:val="center"/>
+          </w:tcPr>
+          <w:p>
+            <w:pPr>
+              <w:spacing w:after="0" w:line="252"/>
+              <w:jc w:val="center"/>
+            </w:pPr>
+            <w:r>
+              <w:rPr>
+                <w:b/>
+                <w:bCs/>
+                <w:sz w:val="20"/>
+                <w:szCs w:val="20"/>
+              </w:rPr>
+              <w:t xml:space="preserve">3 (qoniqarli)</w:t>
+            </w:r>
+          </w:p>
+        </w:tc>
+      </w:tr>
+      <w:tr>
+        <w:tc>
+          <w:tcPr>
+            <w:vMerge w:val="continue"/>
+          </w:tcPr>
+          <w:p/>
+        </w:tc>
+        <w:tc>
+          <w:tcPr>
+            <w:vMerge w:val="continue"/>
+          </w:tcPr>
+          <w:p/>
+        </w:tc>
+        <w:tc>
+          <w:tcPr>
+            <w:tcW w:type="dxa" w:w="4638"/>
+            <w:tcMar>
+              <w:top w:type="dxa" w:w="50"/>
+              <w:left w:type="dxa" w:w="90"/>
+              <w:bottom w:type="dxa" w:w="50"/>
+              <w:right w:type="dxa" w:w="90"/>
+            </w:tcMar>
+            <w:vAlign w:val="top"/>
+          </w:tcPr>
+          <w:p>
+            <w:pPr>
+              <w:spacing w:after="0" w:line="252"/>
+              <w:jc w:val="left"/>
+            </w:pPr>
+            <w:r>
+              <w:rPr>
+                <w:b w:val="false"/>
+                <w:bCs w:val="false"/>
+                <w:sz w:val="20"/>
+                <w:szCs w:val="20"/>
+              </w:rPr>
+              <w:t xml:space="preserve">Zararli va xavfli omillarni to'g'ri aniqlaydi va tasniflaydi, ta'sirini asosan izohlaydi.</w:t>
+            </w:r>
+          </w:p>
+        </w:tc>
+        <w:tc>
+          <w:tcPr>
+            <w:tcW w:type="dxa" w:w="1500"/>
+            <w:shd w:fill="E5EDF8" w:color="auto" w:val="clear"/>
+            <w:tcMar>
+              <w:top w:type="dxa" w:w="50"/>
+              <w:left w:type="dxa" w:w="90"/>
+              <w:bottom w:type="dxa" w:w="50"/>
+              <w:right w:type="dxa" w:w="90"/>
+            </w:tcMar>
+            <w:vAlign w:val="center"/>
+          </w:tcPr>
+          <w:p>
+            <w:pPr>
+              <w:spacing w:after="0" w:line="252"/>
+              <w:jc w:val="center"/>
+            </w:pPr>
+            <w:r>
+              <w:rPr>
+                <w:b/>
+                <w:bCs/>
+                <w:sz w:val="20"/>
+                <w:szCs w:val="20"/>
+              </w:rPr>
+              <w:t xml:space="preserve">4 (yaxshi)</w:t>
+            </w:r>
+          </w:p>
+        </w:tc>
+      </w:tr>
+      <w:tr>
+        <w:tc>
+          <w:tcPr>
+            <w:vMerge w:val="continue"/>
+          </w:tcPr>
+          <w:p/>
+        </w:tc>
+        <w:tc>
+          <w:tcPr>
+            <w:vMerge w:val="continue"/>
+          </w:tcPr>
+          <w:p/>
+        </w:tc>
+        <w:tc>
+          <w:tcPr>
+            <w:tcW w:type="dxa" w:w="4638"/>
+            <w:tcMar>
+              <w:top w:type="dxa" w:w="50"/>
+              <w:left w:type="dxa" w:w="90"/>
+              <w:bottom w:type="dxa" w:w="50"/>
+              <w:right w:type="dxa" w:w="90"/>
+            </w:tcMar>
+            <w:vAlign w:val="top"/>
+          </w:tcPr>
+          <w:p>
+            <w:pPr>
+              <w:spacing w:after="0" w:line="252"/>
+              <w:jc w:val="left"/>
+            </w:pPr>
+            <w:r>
+              <w:rPr>
+                <w:b w:val="false"/>
+                <w:bCs w:val="false"/>
+                <w:sz w:val="20"/>
+                <w:szCs w:val="20"/>
+              </w:rPr>
+              <w:t xml:space="preserve">Zararli va xavfli omillarni to'liq aniqlaydi, tasniflaydi, me'yoriy qiymatlar (PDK, REChD) bilan taqqoslab baholaydi.</w:t>
+            </w:r>
+          </w:p>
+        </w:tc>
+        <w:tc>
+          <w:tcPr>
+            <w:tcW w:type="dxa" w:w="1500"/>
+            <w:shd w:fill="E3F1E3" w:color="auto" w:val="clear"/>
+            <w:tcMar>
+              <w:top w:type="dxa" w:w="50"/>
+              <w:left w:type="dxa" w:w="90"/>
+              <w:bottom w:type="dxa" w:w="50"/>
+              <w:right w:type="dxa" w:w="90"/>
+            </w:tcMar>
+            <w:vAlign w:val="center"/>
+          </w:tcPr>
+          <w:p>
+            <w:pPr>
+              <w:spacing w:after="0" w:line="252"/>
+              <w:jc w:val="center"/>
+            </w:pPr>
+            <w:r>
+              <w:rPr>
+                <w:b/>
+                <w:bCs/>
+                <w:sz w:val="20"/>
+                <w:szCs w:val="20"/>
+              </w:rPr>
+              <w:t xml:space="preserve">5 (a'lo)</w:t>
+            </w:r>
+          </w:p>
+        </w:tc>
+      </w:tr>
+    </w:tbl>
+    <w:p>
+      <w:r>
+        <w:br w:type="page"/>
+      </w:r>
+    </w:p>
+    <w:p>
+      <w:pPr>
+        <w:pStyle w:val="Heading2"/>
+        <w:spacing w:after="140" w:before="240"/>
+      </w:pPr>
+      <w:r>
+        <w:rPr>
+          <w:b/>
+          <w:bCs/>
+          <w:color w:val="2E5496"/>
+          <w:sz w:val="27"/>
+          <w:szCs w:val="27"/>
+        </w:rPr>
+        <w:t xml:space="preserve">4-o'qitish natijasi bo'yicha baholash mezonlari</w:t>
+      </w:r>
+    </w:p>
+    <w:p>
+      <w:pPr>
+        <w:spacing w:after="60" w:before="140"/>
+        <w:jc w:val="left"/>
+      </w:pPr>
+      <w:r>
+        <w:rPr>
+          <w:b/>
+          <w:bCs/>
+          <w:i/>
+          <w:iCs/>
+          <w:color w:val="44546A"/>
+          <w:sz w:val="22"/>
+          <w:szCs w:val="22"/>
+        </w:rPr>
+        <w:t xml:space="preserve">B.4-jadval. Me'yoriy hujjatlar va mehnat muhofazasini tashkil etish bo'yicha baholash</w:t>
+      </w:r>
+    </w:p>
+    <w:tbl>
+      <w:tblPr>
+        <w:tblW w:type="dxa" w:w="9638"/>
+        <w:tblBorders>
+          <w:top w:val="single" w:color="auto" w:sz="4"/>
+          <w:left w:val="single" w:color="auto" w:sz="4"/>
+          <w:bottom w:val="single" w:color="auto" w:sz="4"/>
+          <w:right w:val="single" w:color="auto" w:sz="4"/>
+          <w:insideH w:val="single" w:color="auto" w:sz="4"/>
+          <w:insideV w:val="single" w:color="auto" w:sz="4"/>
+        </w:tblBorders>
+      </w:tblPr>
+      <w:tblGrid>
+        <w:gridCol w:w="1750"/>
+        <w:gridCol w:w="1750"/>
+        <w:gridCol w:w="4638"/>
+        <w:gridCol w:w="1500"/>
+      </w:tblGrid>
+      <w:tr>
+        <w:trPr>
+          <w:tblHeader/>
+        </w:trPr>
+        <w:tc>
+          <w:tcPr>
+            <w:tcW w:type="dxa" w:w="1750"/>
+            <w:shd w:fill="1F3864" w:color="auto" w:val="clear"/>
+            <w:tcMar>
+              <w:top w:type="dxa" w:w="40"/>
+              <w:left w:type="dxa" w:w="90"/>
+              <w:bottom w:type="dxa" w:w="40"/>
+              <w:right w:type="dxa" w:w="90"/>
+            </w:tcMar>
+            <w:vAlign w:val="center"/>
+          </w:tcPr>
+          <w:p>
+            <w:pPr>
+              <w:spacing w:after="0" w:line="264"/>
+              <w:jc w:val="center"/>
+            </w:pPr>
+            <w:r>
+              <w:rPr>
+                <w:b/>
+                <w:bCs/>
+                <w:color w:val="FFFFFF"/>
+                <w:sz w:val="22"/>
+                <w:szCs w:val="22"/>
+              </w:rPr>
+              <w:t xml:space="preserve">O'qitish natijasi</w:t>
+            </w:r>
+          </w:p>
+        </w:tc>
+        <w:tc>
+          <w:tcPr>
+            <w:tcW w:type="dxa" w:w="1750"/>
+            <w:shd w:fill="1F3864" w:color="auto" w:val="clear"/>
+            <w:tcMar>
+              <w:top w:type="dxa" w:w="40"/>
+              <w:left w:type="dxa" w:w="90"/>
+              <w:bottom w:type="dxa" w:w="40"/>
+              <w:right w:type="dxa" w:w="90"/>
+            </w:tcMar>
+            <w:vAlign w:val="center"/>
+          </w:tcPr>
+          <w:p>
+            <w:pPr>
+              <w:spacing w:after="0" w:line="264"/>
+              <w:jc w:val="center"/>
+            </w:pPr>
+            <w:r>
+              <w:rPr>
+                <w:b/>
+                <w:bCs/>
+                <w:color w:val="FFFFFF"/>
+                <w:sz w:val="22"/>
+                <w:szCs w:val="22"/>
+              </w:rPr>
+              <w:t xml:space="preserve">Baholash indikatori</w:t>
+            </w:r>
+          </w:p>
+        </w:tc>
+        <w:tc>
+          <w:tcPr>
+            <w:tcW w:type="dxa" w:w="4638"/>
+            <w:shd w:fill="1F3864" w:color="auto" w:val="clear"/>
+            <w:tcMar>
+              <w:top w:type="dxa" w:w="40"/>
+              <w:left w:type="dxa" w:w="90"/>
+              <w:bottom w:type="dxa" w:w="40"/>
+              <w:right w:type="dxa" w:w="90"/>
+            </w:tcMar>
+            <w:vAlign w:val="center"/>
+          </w:tcPr>
+          <w:p>
+            <w:pPr>
+              <w:spacing w:after="0" w:line="264"/>
+              <w:jc w:val="center"/>
+            </w:pPr>
+            <w:r>
+              <w:rPr>
+                <w:b/>
+                <w:bCs/>
+                <w:color w:val="FFFFFF"/>
+                <w:sz w:val="22"/>
+                <w:szCs w:val="22"/>
+              </w:rPr>
+              <w:t xml:space="preserve">Baholashga qo'yilgan kriteriyalar</w:t>
+            </w:r>
+          </w:p>
+        </w:tc>
+        <w:tc>
+          <w:tcPr>
+            <w:tcW w:type="dxa" w:w="1500"/>
+            <w:shd w:fill="1F3864" w:color="auto" w:val="clear"/>
+            <w:tcMar>
+              <w:top w:type="dxa" w:w="40"/>
+              <w:left w:type="dxa" w:w="90"/>
+              <w:bottom w:type="dxa" w:w="40"/>
+              <w:right w:type="dxa" w:w="90"/>
+            </w:tcMar>
+            <w:vAlign w:val="center"/>
+          </w:tcPr>
+          <w:p>
+            <w:pPr>
+              <w:spacing w:after="0" w:line="264"/>
+              <w:jc w:val="center"/>
+            </w:pPr>
+            <w:r>
+              <w:rPr>
+                <w:b/>
+                <w:bCs/>
+                <w:color w:val="FFFFFF"/>
+                <w:sz w:val="22"/>
+                <w:szCs w:val="22"/>
+              </w:rPr>
+              <w:t xml:space="preserve">Baholanishi</w:t>
+            </w:r>
+          </w:p>
+        </w:tc>
+      </w:tr>
+      <w:tr>
+        <w:tc>
+          <w:tcPr>
+            <w:tcW w:type="dxa" w:w="1750"/>
+            <w:vMerge w:val="restart"/>
+            <w:tcMar>
+              <w:top w:type="dxa" w:w="50"/>
+              <w:left w:type="dxa" w:w="90"/>
+              <w:bottom w:type="dxa" w:w="50"/>
+              <w:right w:type="dxa" w:w="90"/>
+            </w:tcMar>
+            <w:vAlign w:val="center"/>
+          </w:tcPr>
+          <w:p>
+            <w:pPr>
+              <w:spacing w:after="0" w:line="252"/>
+              <w:jc w:val="left"/>
+            </w:pPr>
+            <w:r>
+              <w:rPr>
+                <w:b/>
+                <w:bCs/>
+                <w:sz w:val="20"/>
+                <w:szCs w:val="20"/>
+              </w:rPr>
+              <w:t xml:space="preserve">Mehnat muhofazasining me'yoriy-huquqiy hujjatlaridan foydalanadi va mehnat muhofazasini tashkil etish asoslarini biladi.</w:t>
+            </w:r>
+          </w:p>
+        </w:tc>
+        <w:tc>
+          <w:tcPr>
+            <w:tcW w:type="dxa" w:w="1750"/>
+            <w:vMerge w:val="restart"/>
+            <w:tcMar>
+              <w:top w:type="dxa" w:w="50"/>
+              <w:left w:type="dxa" w:w="90"/>
+              <w:bottom w:type="dxa" w:w="50"/>
+              <w:right w:type="dxa" w:w="90"/>
+            </w:tcMar>
+            <w:vAlign w:val="center"/>
+          </w:tcPr>
+          <w:p>
+            <w:pPr>
+              <w:spacing w:after="0" w:line="252"/>
+              <w:jc w:val="left"/>
+            </w:pPr>
+            <w:r>
+              <w:rPr>
+                <w:b w:val="false"/>
+                <w:bCs w:val="false"/>
+                <w:sz w:val="20"/>
+                <w:szCs w:val="20"/>
+              </w:rPr>
+              <w:t xml:space="preserve">Me'yoriy-huquqiy hujjatlarni bilish va qo'llash.</w:t>
+            </w:r>
+          </w:p>
+        </w:tc>
+        <w:tc>
+          <w:tcPr>
+            <w:tcW w:type="dxa" w:w="4638"/>
+            <w:tcMar>
+              <w:top w:type="dxa" w:w="50"/>
+              <w:left w:type="dxa" w:w="90"/>
+              <w:bottom w:type="dxa" w:w="50"/>
+              <w:right w:type="dxa" w:w="90"/>
+            </w:tcMar>
+            <w:vAlign w:val="top"/>
+          </w:tcPr>
+          <w:p>
+            <w:pPr>
+              <w:spacing w:after="0" w:line="252"/>
+              <w:jc w:val="left"/>
+            </w:pPr>
+            <w:r>
+              <w:rPr>
+                <w:b w:val="false"/>
+                <w:bCs w:val="false"/>
+                <w:sz w:val="20"/>
+                <w:szCs w:val="20"/>
+              </w:rPr>
+              <w:t xml:space="preserve">Mehnat muhofazasiga oid me'yoriy hujjatlarni bilmaydi, ularning mazmunini tushuntirmaydi.</w:t>
+            </w:r>
+          </w:p>
+        </w:tc>
+        <w:tc>
+          <w:tcPr>
+            <w:tcW w:type="dxa" w:w="1500"/>
+            <w:shd w:fill="FBE2E2" w:color="auto" w:val="clear"/>
+            <w:tcMar>
+              <w:top w:type="dxa" w:w="50"/>
+              <w:left w:type="dxa" w:w="90"/>
+              <w:bottom w:type="dxa" w:w="50"/>
+              <w:right w:type="dxa" w:w="90"/>
+            </w:tcMar>
+            <w:vAlign w:val="center"/>
+          </w:tcPr>
+          <w:p>
+            <w:pPr>
+              <w:spacing w:after="0" w:line="252"/>
+              <w:jc w:val="center"/>
+            </w:pPr>
+            <w:r>
+              <w:rPr>
+                <w:b/>
+                <w:bCs/>
+                <w:sz w:val="20"/>
+                <w:szCs w:val="20"/>
+              </w:rPr>
+              <w:t xml:space="preserve">2 (qoniqarsiz)</w:t>
+            </w:r>
+          </w:p>
+        </w:tc>
+      </w:tr>
+      <w:tr>
+        <w:tc>
+          <w:tcPr>
+            <w:vMerge w:val="continue"/>
+          </w:tcPr>
+          <w:p/>
+        </w:tc>
+        <w:tc>
+          <w:tcPr>
+            <w:vMerge w:val="continue"/>
+          </w:tcPr>
+          <w:p/>
+        </w:tc>
+        <w:tc>
+          <w:tcPr>
+            <w:tcW w:type="dxa" w:w="4638"/>
+            <w:tcMar>
+              <w:top w:type="dxa" w:w="50"/>
+              <w:left w:type="dxa" w:w="90"/>
+              <w:bottom w:type="dxa" w:w="50"/>
+              <w:right w:type="dxa" w:w="90"/>
+            </w:tcMar>
+            <w:vAlign w:val="top"/>
+          </w:tcPr>
+          <w:p>
+            <w:pPr>
+              <w:spacing w:after="0" w:line="252"/>
+              <w:jc w:val="left"/>
+            </w:pPr>
+            <w:r>
+              <w:rPr>
+                <w:b w:val="false"/>
+                <w:bCs w:val="false"/>
+                <w:sz w:val="20"/>
+                <w:szCs w:val="20"/>
+              </w:rPr>
+              <w:t xml:space="preserve">Asosiy hujjatlarni qisman biladi, ayrim talablarni sanaydi, biroq qo'llashni izohlay olmaydi.</w:t>
+            </w:r>
+          </w:p>
+        </w:tc>
+        <w:tc>
+          <w:tcPr>
+            <w:tcW w:type="dxa" w:w="1500"/>
+            <w:shd w:fill="FFF4D6" w:color="auto" w:val="clear"/>
+            <w:tcMar>
+              <w:top w:type="dxa" w:w="50"/>
+              <w:left w:type="dxa" w:w="90"/>
+              <w:bottom w:type="dxa" w:w="50"/>
+              <w:right w:type="dxa" w:w="90"/>
+            </w:tcMar>
+            <w:vAlign w:val="center"/>
+          </w:tcPr>
+          <w:p>
+            <w:pPr>
+              <w:spacing w:after="0" w:line="252"/>
+              <w:jc w:val="center"/>
+            </w:pPr>
+            <w:r>
+              <w:rPr>
+                <w:b/>
+                <w:bCs/>
+                <w:sz w:val="20"/>
+                <w:szCs w:val="20"/>
+              </w:rPr>
+              <w:t xml:space="preserve">3 (qoniqarli)</w:t>
+            </w:r>
+          </w:p>
+        </w:tc>
+      </w:tr>
+      <w:tr>
+        <w:tc>
+          <w:tcPr>
+            <w:vMerge w:val="continue"/>
+          </w:tcPr>
+          <w:p/>
+        </w:tc>
+        <w:tc>
+          <w:tcPr>
+            <w:vMerge w:val="continue"/>
+          </w:tcPr>
+          <w:p/>
+        </w:tc>
+        <w:tc>
+          <w:tcPr>
+            <w:tcW w:type="dxa" w:w="4638"/>
+            <w:tcMar>
+              <w:top w:type="dxa" w:w="50"/>
+              <w:left w:type="dxa" w:w="90"/>
+              <w:bottom w:type="dxa" w:w="50"/>
+              <w:right w:type="dxa" w:w="90"/>
+            </w:tcMar>
+            <w:vAlign w:val="top"/>
+          </w:tcPr>
+          <w:p>
+            <w:pPr>
+              <w:spacing w:after="0" w:line="252"/>
+              <w:jc w:val="left"/>
+            </w:pPr>
+            <w:r>
+              <w:rPr>
+                <w:b w:val="false"/>
+                <w:bCs w:val="false"/>
+                <w:sz w:val="20"/>
+                <w:szCs w:val="20"/>
+              </w:rPr>
+              <w:t xml:space="preserve">Me'yoriy hujjatlarni to'g'ri biladi, asosiy talablarni tushuntiradi va amaliyotda qo'llashni izohlaydi.</w:t>
+            </w:r>
+          </w:p>
+        </w:tc>
+        <w:tc>
+          <w:tcPr>
+            <w:tcW w:type="dxa" w:w="1500"/>
+            <w:shd w:fill="E5EDF8" w:color="auto" w:val="clear"/>
+            <w:tcMar>
+              <w:top w:type="dxa" w:w="50"/>
+              <w:left w:type="dxa" w:w="90"/>
+              <w:bottom w:type="dxa" w:w="50"/>
+              <w:right w:type="dxa" w:w="90"/>
+            </w:tcMar>
+            <w:vAlign w:val="center"/>
+          </w:tcPr>
+          <w:p>
+            <w:pPr>
+              <w:spacing w:after="0" w:line="252"/>
+              <w:jc w:val="center"/>
+            </w:pPr>
+            <w:r>
+              <w:rPr>
+                <w:b/>
+                <w:bCs/>
+                <w:sz w:val="20"/>
+                <w:szCs w:val="20"/>
+              </w:rPr>
+              <w:t xml:space="preserve">4 (yaxshi)</w:t>
+            </w:r>
+          </w:p>
+        </w:tc>
+      </w:tr>
+      <w:tr>
+        <w:tc>
+          <w:tcPr>
+            <w:vMerge w:val="continue"/>
+          </w:tcPr>
+          <w:p/>
+        </w:tc>
+        <w:tc>
+          <w:tcPr>
+            <w:vMerge w:val="continue"/>
+          </w:tcPr>
+          <w:p/>
+        </w:tc>
+        <w:tc>
+          <w:tcPr>
+            <w:tcW w:type="dxa" w:w="4638"/>
+            <w:tcMar>
+              <w:top w:type="dxa" w:w="50"/>
+              <w:left w:type="dxa" w:w="90"/>
+              <w:bottom w:type="dxa" w:w="50"/>
+              <w:right w:type="dxa" w:w="90"/>
+            </w:tcMar>
+            <w:vAlign w:val="top"/>
+          </w:tcPr>
+          <w:p>
+            <w:pPr>
+              <w:spacing w:after="0" w:line="252"/>
+              <w:jc w:val="left"/>
+            </w:pPr>
+            <w:r>
+              <w:rPr>
+                <w:b w:val="false"/>
+                <w:bCs w:val="false"/>
+                <w:sz w:val="20"/>
+                <w:szCs w:val="20"/>
+              </w:rPr>
+              <w:t xml:space="preserve">Me'yoriy hujjatlar tizimini to'liq biladi, talablarni asoslaydi va aniq vaziyatlarga mustaqil qo'llaydi.</w:t>
+            </w:r>
+          </w:p>
+        </w:tc>
+        <w:tc>
+          <w:tcPr>
+            <w:tcW w:type="dxa" w:w="1500"/>
+            <w:shd w:fill="E3F1E3" w:color="auto" w:val="clear"/>
+            <w:tcMar>
+              <w:top w:type="dxa" w:w="50"/>
+              <w:left w:type="dxa" w:w="90"/>
+              <w:bottom w:type="dxa" w:w="50"/>
+              <w:right w:type="dxa" w:w="90"/>
+            </w:tcMar>
+            <w:vAlign w:val="center"/>
+          </w:tcPr>
+          <w:p>
+            <w:pPr>
+              <w:spacing w:after="0" w:line="252"/>
+              <w:jc w:val="center"/>
+            </w:pPr>
+            <w:r>
+              <w:rPr>
+                <w:b/>
+                <w:bCs/>
+                <w:sz w:val="20"/>
+                <w:szCs w:val="20"/>
+              </w:rPr>
+              <w:t xml:space="preserve">5 (a'lo)</w:t>
+            </w:r>
+          </w:p>
+        </w:tc>
+      </w:tr>
+      <w:tr>
+        <w:tc>
+          <w:tcPr>
+            <w:vMerge w:val="continue"/>
+          </w:tcPr>
+          <w:p/>
+        </w:tc>
+        <w:tc>
+          <w:tcPr>
+            <w:tcW w:type="dxa" w:w="1750"/>
+            <w:vMerge w:val="restart"/>
+            <w:tcMar>
+              <w:top w:type="dxa" w:w="50"/>
+              <w:left w:type="dxa" w:w="90"/>
+              <w:bottom w:type="dxa" w:w="50"/>
+              <w:right w:type="dxa" w:w="90"/>
+            </w:tcMar>
+            <w:vAlign w:val="center"/>
+          </w:tcPr>
+          <w:p>
+            <w:pPr>
+              <w:spacing w:after="0" w:line="252"/>
+              <w:jc w:val="left"/>
+            </w:pPr>
+            <w:r>
+              <w:rPr>
+                <w:b w:val="false"/>
+                <w:bCs w:val="false"/>
+                <w:sz w:val="20"/>
+                <w:szCs w:val="20"/>
+              </w:rPr>
+              <w:t xml:space="preserve">Baxtsiz hodisalar va yo'riqnomalarni tashkil etishni bilish.</w:t>
+            </w:r>
+          </w:p>
+        </w:tc>
+        <w:tc>
+          <w:tcPr>
+            <w:tcW w:type="dxa" w:w="4638"/>
+            <w:tcMar>
+              <w:top w:type="dxa" w:w="50"/>
+              <w:left w:type="dxa" w:w="90"/>
+              <w:bottom w:type="dxa" w:w="50"/>
+              <w:right w:type="dxa" w:w="90"/>
+            </w:tcMar>
+            <w:vAlign w:val="top"/>
+          </w:tcPr>
+          <w:p>
+            <w:pPr>
+              <w:spacing w:after="0" w:line="252"/>
+              <w:jc w:val="left"/>
+            </w:pPr>
+            <w:r>
+              <w:rPr>
+                <w:b w:val="false"/>
+                <w:bCs w:val="false"/>
+                <w:sz w:val="20"/>
+                <w:szCs w:val="20"/>
+              </w:rPr>
+              <w:t xml:space="preserve">Yo'riqnoma turlarini va baxtsiz hodisalarni tekshirish tartibini bilmaydi.</w:t>
+            </w:r>
+          </w:p>
+        </w:tc>
+        <w:tc>
+          <w:tcPr>
+            <w:tcW w:type="dxa" w:w="1500"/>
+            <w:shd w:fill="FBE2E2" w:color="auto" w:val="clear"/>
+            <w:tcMar>
+              <w:top w:type="dxa" w:w="50"/>
+              <w:left w:type="dxa" w:w="90"/>
+              <w:bottom w:type="dxa" w:w="50"/>
+              <w:right w:type="dxa" w:w="90"/>
+            </w:tcMar>
+            <w:vAlign w:val="center"/>
+          </w:tcPr>
+          <w:p>
+            <w:pPr>
+              <w:spacing w:after="0" w:line="252"/>
+              <w:jc w:val="center"/>
+            </w:pPr>
+            <w:r>
+              <w:rPr>
+                <w:b/>
+                <w:bCs/>
+                <w:sz w:val="20"/>
+                <w:szCs w:val="20"/>
+              </w:rPr>
+              <w:t xml:space="preserve">2 (qoniqarsiz)</w:t>
+            </w:r>
+          </w:p>
+        </w:tc>
+      </w:tr>
+      <w:tr>
+        <w:tc>
+          <w:tcPr>
+            <w:vMerge w:val="continue"/>
+          </w:tcPr>
+          <w:p/>
+        </w:tc>
+        <w:tc>
+          <w:tcPr>
+            <w:vMerge w:val="continue"/>
+          </w:tcPr>
+          <w:p/>
+        </w:tc>
+        <w:tc>
+          <w:tcPr>
+            <w:tcW w:type="dxa" w:w="4638"/>
+            <w:tcMar>
+              <w:top w:type="dxa" w:w="50"/>
+              <w:left w:type="dxa" w:w="90"/>
+              <w:bottom w:type="dxa" w:w="50"/>
+              <w:right w:type="dxa" w:w="90"/>
+            </w:tcMar>
+            <w:vAlign w:val="top"/>
+          </w:tcPr>
+          <w:p>
+            <w:pPr>
+              <w:spacing w:after="0" w:line="252"/>
+              <w:jc w:val="left"/>
+            </w:pPr>
+            <w:r>
+              <w:rPr>
+                <w:b w:val="false"/>
+                <w:bCs w:val="false"/>
+                <w:sz w:val="20"/>
+                <w:szCs w:val="20"/>
+              </w:rPr>
+              <w:t xml:space="preserve">Yo'riqnoma turlarini qisman biladi, tartibni to'liq tushuntirmaydi.</w:t>
+            </w:r>
+          </w:p>
+        </w:tc>
+        <w:tc>
+          <w:tcPr>
+            <w:tcW w:type="dxa" w:w="1500"/>
+            <w:shd w:fill="FFF4D6" w:color="auto" w:val="clear"/>
+            <w:tcMar>
+              <w:top w:type="dxa" w:w="50"/>
+              <w:left w:type="dxa" w:w="90"/>
+              <w:bottom w:type="dxa" w:w="50"/>
+              <w:right w:type="dxa" w:w="90"/>
+            </w:tcMar>
+            <w:vAlign w:val="center"/>
+          </w:tcPr>
+          <w:p>
+            <w:pPr>
+              <w:spacing w:after="0" w:line="252"/>
+              <w:jc w:val="center"/>
+            </w:pPr>
+            <w:r>
+              <w:rPr>
+                <w:b/>
+                <w:bCs/>
+                <w:sz w:val="20"/>
+                <w:szCs w:val="20"/>
+              </w:rPr>
+              <w:t xml:space="preserve">3 (qoniqarli)</w:t>
+            </w:r>
+          </w:p>
+        </w:tc>
+      </w:tr>
+      <w:tr>
+        <w:tc>
+          <w:tcPr>
+            <w:vMerge w:val="continue"/>
+          </w:tcPr>
+          <w:p/>
+        </w:tc>
+        <w:tc>
+          <w:tcPr>
+            <w:vMerge w:val="continue"/>
+          </w:tcPr>
+          <w:p/>
+        </w:tc>
+        <w:tc>
+          <w:tcPr>
+            <w:tcW w:type="dxa" w:w="4638"/>
+            <w:tcMar>
+              <w:top w:type="dxa" w:w="50"/>
+              <w:left w:type="dxa" w:w="90"/>
+              <w:bottom w:type="dxa" w:w="50"/>
+              <w:right w:type="dxa" w:w="90"/>
+            </w:tcMar>
+            <w:vAlign w:val="top"/>
+          </w:tcPr>
+          <w:p>
+            <w:pPr>
+              <w:spacing w:after="0" w:line="252"/>
+              <w:jc w:val="left"/>
+            </w:pPr>
+            <w:r>
+              <w:rPr>
+                <w:b w:val="false"/>
+                <w:bCs w:val="false"/>
+                <w:sz w:val="20"/>
+                <w:szCs w:val="20"/>
+              </w:rPr>
+              <w:t xml:space="preserve">Yo'riqnoma turlarini va baxtsiz hodisalarni tekshirish tartibini to'g'ri tushuntiradi.</w:t>
+            </w:r>
+          </w:p>
+        </w:tc>
+        <w:tc>
+          <w:tcPr>
+            <w:tcW w:type="dxa" w:w="1500"/>
+            <w:shd w:fill="E5EDF8" w:color="auto" w:val="clear"/>
+            <w:tcMar>
+              <w:top w:type="dxa" w:w="50"/>
+              <w:left w:type="dxa" w:w="90"/>
+              <w:bottom w:type="dxa" w:w="50"/>
+              <w:right w:type="dxa" w:w="90"/>
+            </w:tcMar>
+            <w:vAlign w:val="center"/>
+          </w:tcPr>
+          <w:p>
+            <w:pPr>
+              <w:spacing w:after="0" w:line="252"/>
+              <w:jc w:val="center"/>
+            </w:pPr>
+            <w:r>
+              <w:rPr>
+                <w:b/>
+                <w:bCs/>
+                <w:sz w:val="20"/>
+                <w:szCs w:val="20"/>
+              </w:rPr>
+              <w:t xml:space="preserve">4 (yaxshi)</w:t>
+            </w:r>
+          </w:p>
+        </w:tc>
+      </w:tr>
+      <w:tr>
+        <w:tc>
+          <w:tcPr>
+            <w:vMerge w:val="continue"/>
+          </w:tcPr>
+          <w:p/>
+        </w:tc>
+        <w:tc>
+          <w:tcPr>
+            <w:vMerge w:val="continue"/>
+          </w:tcPr>
+          <w:p/>
+        </w:tc>
+        <w:tc>
+          <w:tcPr>
+            <w:tcW w:type="dxa" w:w="4638"/>
+            <w:tcMar>
+              <w:top w:type="dxa" w:w="50"/>
+              <w:left w:type="dxa" w:w="90"/>
+              <w:bottom w:type="dxa" w:w="50"/>
+              <w:right w:type="dxa" w:w="90"/>
+            </w:tcMar>
+            <w:vAlign w:val="top"/>
+          </w:tcPr>
+          <w:p>
+            <w:pPr>
+              <w:spacing w:after="0" w:line="252"/>
+              <w:jc w:val="left"/>
+            </w:pPr>
+            <w:r>
+              <w:rPr>
+                <w:b w:val="false"/>
+                <w:bCs w:val="false"/>
+                <w:sz w:val="20"/>
+                <w:szCs w:val="20"/>
+              </w:rPr>
+              <w:t xml:space="preserve">Yo'riqnoma va baxtsiz hodisalarni tekshirish tartibini to'liq, ketma-ketlikda va misollar bilan tushuntiradi.</w:t>
+            </w:r>
+          </w:p>
+        </w:tc>
+        <w:tc>
+          <w:tcPr>
+            <w:tcW w:type="dxa" w:w="1500"/>
+            <w:shd w:fill="E3F1E3" w:color="auto" w:val="clear"/>
+            <w:tcMar>
+              <w:top w:type="dxa" w:w="50"/>
+              <w:left w:type="dxa" w:w="90"/>
+              <w:bottom w:type="dxa" w:w="50"/>
+              <w:right w:type="dxa" w:w="90"/>
+            </w:tcMar>
+            <w:vAlign w:val="center"/>
+          </w:tcPr>
+          <w:p>
+            <w:pPr>
+              <w:spacing w:after="0" w:line="252"/>
+              <w:jc w:val="center"/>
+            </w:pPr>
+            <w:r>
+              <w:rPr>
+                <w:b/>
+                <w:bCs/>
+                <w:sz w:val="20"/>
+                <w:szCs w:val="20"/>
+              </w:rPr>
+              <w:t xml:space="preserve">5 (a'lo)</w:t>
+            </w:r>
+          </w:p>
+        </w:tc>
+      </w:tr>
+    </w:tbl>
+    <w:p>
+      <w:pPr>
+        <w:spacing w:after="120" w:before="120" w:line="360"/>
+        <w:ind w:firstLine="709"/>
+        <w:jc w:val="both"/>
+      </w:pPr>
+      <w:r>
+        <w:t xml:space="preserve">Yakuniy baho o'quvchining barcha o'qitish natijalari bo'yicha ko'rsatgan natijalarining o'rtacha qiymati asosida qo'yiladi. Baholashda o'quvchining nazariy bilimlari bilan bir qatorda amaliy ko'nikmalari va xavfsiz mehnat madaniyatiga rioya qilishi ham hisobga olinadi.</w:t>
       </w:r>
     </w:p>
     <w:p>

</xml_diff>